<commit_message>
Regenerar evidencias y documentos con las capturas incrustadas
Corrida completa sobre base limpia (commit 693358a):
- Ciclo 1: 23 aprobados, 9 fallidos, 2 bloqueados (Google).
- Ciclo 2: 7 aprobados y los mismos 9 fallidos.
- Defectos exploratorios: DEF-05 verificado; DEF-06, 07, 10 y 14 abiertos.
- Consola F12: CP-008 (400), CP-018 (403), CP-021 (404) y los defectos
  DEF-06 (200), DEF-10 (201) y DEF-13 (inspección de #tostada).

E2_F_Equipo trae las 77 capturas como figuras: debajo de cada reporte
de defecto, en el Anexo D (consola) y en el nuevo Anexo E (ciclos 1 y 2).
La Tarea 4 trae las capturas de consola en el Anexo F y las de los ocho
defectos en el nuevo Anexo G, citadas por número de figura.

Co-Authored-By: Claude Opus 5.5 <noreply@anthropic.com>
Claude-Session: https://claude.ai/code/session_01QPYavKj2sG2dhvsf1XDSZo
</commit_message>
<xml_diff>
--- a/docs/entrega-2/IS071_T4_EquipoF.docx
+++ b/docs/entrega-2/IS071_T4_EquipoF.docx
@@ -130,6 +130,9 @@
         <w:gridCol w:w="4873"/>
       </w:tblGrid>
       <w:tr>
+        <w:trPr>
+          <w:cantSplit w:val="true"/>
+        </w:trPr>
         <w:tc>
           <w:tcPr>
             <w:tcW w:type="dxa" w:w="2381"/>
@@ -175,6 +178,9 @@
         </w:tc>
       </w:tr>
       <w:tr>
+        <w:trPr>
+          <w:cantSplit w:val="true"/>
+        </w:trPr>
         <w:tc>
           <w:tcPr>
             <w:tcW w:type="dxa" w:w="2381"/>
@@ -220,6 +226,9 @@
         </w:tc>
       </w:tr>
       <w:tr>
+        <w:trPr>
+          <w:cantSplit w:val="true"/>
+        </w:trPr>
         <w:tc>
           <w:tcPr>
             <w:tcW w:type="dxa" w:w="2381"/>
@@ -265,6 +274,9 @@
         </w:tc>
       </w:tr>
       <w:tr>
+        <w:trPr>
+          <w:cantSplit w:val="true"/>
+        </w:trPr>
         <w:tc>
           <w:tcPr>
             <w:tcW w:type="dxa" w:w="2381"/>
@@ -310,6 +322,9 @@
         </w:tc>
       </w:tr>
       <w:tr>
+        <w:trPr>
+          <w:cantSplit w:val="true"/>
+        </w:trPr>
         <w:tc>
           <w:tcPr>
             <w:tcW w:type="dxa" w:w="2381"/>
@@ -355,6 +370,9 @@
         </w:tc>
       </w:tr>
       <w:tr>
+        <w:trPr>
+          <w:cantSplit w:val="true"/>
+        </w:trPr>
         <w:tc>
           <w:tcPr>
             <w:tcW w:type="dxa" w:w="2381"/>
@@ -400,6 +418,9 @@
         </w:tc>
       </w:tr>
       <w:tr>
+        <w:trPr>
+          <w:cantSplit w:val="true"/>
+        </w:trPr>
         <w:tc>
           <w:tcPr>
             <w:tcW w:type="dxa" w:w="2381"/>
@@ -445,6 +466,9 @@
         </w:tc>
       </w:tr>
       <w:tr>
+        <w:trPr>
+          <w:cantSplit w:val="true"/>
+        </w:trPr>
         <w:tc>
           <w:tcPr>
             <w:tcW w:type="dxa" w:w="2381"/>
@@ -537,6 +561,9 @@
         <w:gridCol w:w="2436"/>
       </w:tblGrid>
       <w:tr>
+        <w:trPr>
+          <w:cantSplit w:val="true"/>
+        </w:trPr>
         <w:tc>
           <w:tcPr>
             <w:tcW w:type="dxa" w:w="2721"/>
@@ -643,6 +670,9 @@
         </w:tc>
       </w:tr>
       <w:tr>
+        <w:trPr>
+          <w:cantSplit w:val="true"/>
+        </w:trPr>
         <w:tc>
           <w:tcPr>
             <w:tcW w:type="dxa" w:w="2721"/>
@@ -728,6 +758,9 @@
         </w:tc>
       </w:tr>
       <w:tr>
+        <w:trPr>
+          <w:cantSplit w:val="true"/>
+        </w:trPr>
         <w:tc>
           <w:tcPr>
             <w:tcW w:type="dxa" w:w="2721"/>
@@ -873,6 +906,9 @@
         <w:gridCol w:w="9746"/>
       </w:tblGrid>
       <w:tr>
+        <w:trPr>
+          <w:cantSplit w:val="true"/>
+        </w:trPr>
         <w:tc>
           <w:tcPr>
             <w:tcW w:type="dxa" w:w="9746"/>
@@ -960,6 +996,9 @@
         <w:gridCol w:w="1392"/>
       </w:tblGrid>
       <w:tr>
+        <w:trPr>
+          <w:cantSplit w:val="true"/>
+        </w:trPr>
         <w:tc>
           <w:tcPr>
             <w:tcW w:type="dxa" w:w="850"/>
@@ -1144,6 +1183,9 @@
         </w:tc>
       </w:tr>
       <w:tr>
+        <w:trPr>
+          <w:cantSplit w:val="true"/>
+        </w:trPr>
         <w:tc>
           <w:tcPr>
             <w:tcW w:type="dxa" w:w="850"/>
@@ -1293,6 +1335,9 @@
         </w:tc>
       </w:tr>
       <w:tr>
+        <w:trPr>
+          <w:cantSplit w:val="true"/>
+        </w:trPr>
         <w:tc>
           <w:tcPr>
             <w:tcW w:type="dxa" w:w="850"/>
@@ -1449,6 +1494,9 @@
         </w:tc>
       </w:tr>
       <w:tr>
+        <w:trPr>
+          <w:cantSplit w:val="true"/>
+        </w:trPr>
         <w:tc>
           <w:tcPr>
             <w:tcW w:type="dxa" w:w="850"/>
@@ -1598,6 +1646,9 @@
         </w:tc>
       </w:tr>
       <w:tr>
+        <w:trPr>
+          <w:cantSplit w:val="true"/>
+        </w:trPr>
         <w:tc>
           <w:tcPr>
             <w:tcW w:type="dxa" w:w="850"/>
@@ -1754,6 +1805,9 @@
         </w:tc>
       </w:tr>
       <w:tr>
+        <w:trPr>
+          <w:cantSplit w:val="true"/>
+        </w:trPr>
         <w:tc>
           <w:tcPr>
             <w:tcW w:type="dxa" w:w="850"/>
@@ -1903,6 +1957,9 @@
         </w:tc>
       </w:tr>
       <w:tr>
+        <w:trPr>
+          <w:cantSplit w:val="true"/>
+        </w:trPr>
         <w:tc>
           <w:tcPr>
             <w:tcW w:type="dxa" w:w="850"/>
@@ -2059,6 +2116,9 @@
         </w:tc>
       </w:tr>
       <w:tr>
+        <w:trPr>
+          <w:cantSplit w:val="true"/>
+        </w:trPr>
         <w:tc>
           <w:tcPr>
             <w:tcW w:type="dxa" w:w="850"/>
@@ -2208,6 +2268,9 @@
         </w:tc>
       </w:tr>
       <w:tr>
+        <w:trPr>
+          <w:cantSplit w:val="true"/>
+        </w:trPr>
         <w:tc>
           <w:tcPr>
             <w:tcW w:type="dxa" w:w="850"/>
@@ -2405,6 +2468,8 @@
     </w:p>
     <w:p>
       <w:pPr>
+        <w:keepNext/>
+        <w:spacing w:before="80" w:after="40"/>
         <w:jc w:val="center"/>
       </w:pPr>
       <w:r>
@@ -2444,16 +2509,23 @@
     </w:p>
     <w:p>
       <w:pPr>
-        <w:spacing w:after="120"/>
+        <w:spacing w:after="200"/>
         <w:jc w:val="center"/>
       </w:pPr>
       <w:r>
         <w:rPr>
-          <w:b w:val="0"/>
+          <w:b/>
           <w:i/>
           <w:sz w:val="18"/>
         </w:rPr>
-        <w:t>Figura 1. Defectos por requisito y severidad (los catorce del Entregable 2). Fuente: registro de defectos del equipo.</w:t>
+        <w:t xml:space="preserve">Figura 1. </w:t>
+      </w:r>
+      <w:r>
+        <w:rPr>
+          <w:i/>
+          <w:sz w:val="18"/>
+        </w:rPr>
+        <w:t>Defectos por requisito y severidad (los catorce del Entregable 2). Fuente: registro de defectos del equipo.</w:t>
       </w:r>
     </w:p>
     <w:p>
@@ -2499,6 +2571,9 @@
         <w:gridCol w:w="9746"/>
       </w:tblGrid>
       <w:tr>
+        <w:trPr>
+          <w:cantSplit w:val="true"/>
+        </w:trPr>
         <w:tc>
           <w:tcPr>
             <w:tcW w:type="dxa" w:w="9746"/>
@@ -2611,7 +2686,7 @@
           <w:i/>
           <w:sz w:val="20"/>
         </w:rPr>
-        <w:t>Entorno común: Chromium 141 · ConectaProfe en Railway/local, commit 693358a · ejecución automatizada con Playwright. Cuentas de semilla con contraseña «123456».</w:t>
+        <w:t>Entorno común: Chromium 141.0.7390.37 · Linux · ConectaProfe en copia local del commit 693358a, la misma versión desplegada en Railway · ejecución automatizada con Playwright el 07/10/2026. Cuentas de semilla con contraseña «123456». Las capturas de cada reporte están en el Anexo G (y las de consola en el Anexo F), con el número de figura que se cita en el campo «Evidencia».</w:t>
       </w:r>
     </w:p>
     <w:p>
@@ -2640,6 +2715,9 @@
         <w:gridCol w:w="4873"/>
       </w:tblGrid>
       <w:tr>
+        <w:trPr>
+          <w:cantSplit w:val="true"/>
+        </w:trPr>
         <w:tc>
           <w:tcPr>
             <w:tcW w:type="dxa" w:w="2381"/>
@@ -2685,6 +2763,9 @@
         </w:tc>
       </w:tr>
       <w:tr>
+        <w:trPr>
+          <w:cantSplit w:val="true"/>
+        </w:trPr>
         <w:tc>
           <w:tcPr>
             <w:tcW w:type="dxa" w:w="2381"/>
@@ -2730,6 +2811,9 @@
         </w:tc>
       </w:tr>
       <w:tr>
+        <w:trPr>
+          <w:cantSplit w:val="true"/>
+        </w:trPr>
         <w:tc>
           <w:tcPr>
             <w:tcW w:type="dxa" w:w="2381"/>
@@ -2769,12 +2853,15 @@
                 <w:b w:val="0"/>
                 <w:sz w:val="19"/>
               </w:rPr>
-              <w:t>Chromium 141 · Linux · Railway/local, commit 693358a</w:t>
+              <w:t>Chromium 141.0.7390.37 · Linux · ConectaProfe en copia local del commit 693358a, la misma versión desplegada en Railway · ejecución automatizada con Playwright el 07/10/2026</w:t>
             </w:r>
           </w:p>
         </w:tc>
       </w:tr>
       <w:tr>
+        <w:trPr>
+          <w:cantSplit w:val="true"/>
+        </w:trPr>
         <w:tc>
           <w:tcPr>
             <w:tcW w:type="dxa" w:w="2381"/>
@@ -2820,6 +2907,9 @@
         </w:tc>
       </w:tr>
       <w:tr>
+        <w:trPr>
+          <w:cantSplit w:val="true"/>
+        </w:trPr>
         <w:tc>
           <w:tcPr>
             <w:tcW w:type="dxa" w:w="2381"/>
@@ -2883,6 +2973,9 @@
         </w:tc>
       </w:tr>
       <w:tr>
+        <w:trPr>
+          <w:cantSplit w:val="true"/>
+        </w:trPr>
         <w:tc>
           <w:tcPr>
             <w:tcW w:type="dxa" w:w="2381"/>
@@ -2928,6 +3021,9 @@
         </w:tc>
       </w:tr>
       <w:tr>
+        <w:trPr>
+          <w:cantSplit w:val="true"/>
+        </w:trPr>
         <w:tc>
           <w:tcPr>
             <w:tcW w:type="dxa" w:w="2381"/>
@@ -2973,6 +3069,9 @@
         </w:tc>
       </w:tr>
       <w:tr>
+        <w:trPr>
+          <w:cantSplit w:val="true"/>
+        </w:trPr>
         <w:tc>
           <w:tcPr>
             <w:tcW w:type="dxa" w:w="2381"/>
@@ -3018,6 +3117,9 @@
         </w:tc>
       </w:tr>
       <w:tr>
+        <w:trPr>
+          <w:cantSplit w:val="true"/>
+        </w:trPr>
         <w:tc>
           <w:tcPr>
             <w:tcW w:type="dxa" w:w="2381"/>
@@ -3063,6 +3165,9 @@
         </w:tc>
       </w:tr>
       <w:tr>
+        <w:trPr>
+          <w:cantSplit w:val="true"/>
+        </w:trPr>
         <w:tc>
           <w:tcPr>
             <w:tcW w:type="dxa" w:w="2381"/>
@@ -3108,6 +3213,9 @@
         </w:tc>
       </w:tr>
       <w:tr>
+        <w:trPr>
+          <w:cantSplit w:val="true"/>
+        </w:trPr>
         <w:tc>
           <w:tcPr>
             <w:tcW w:type="dxa" w:w="2381"/>
@@ -3147,12 +3255,15 @@
                 <w:b w:val="0"/>
                 <w:sz w:val="19"/>
               </w:rPr>
-              <w:t>EV-CP034-C1-01.png, EV-CP034-C1-02.png, EV-CP034-C1-03.png</w:t>
+              <w:t>EV-CP034-C1-01.png, EV-CP034-C1-02.png, EV-CP034-C1-03.png (Anexo G, figuras 8 a 10)</w:t>
             </w:r>
           </w:p>
         </w:tc>
       </w:tr>
       <w:tr>
+        <w:trPr>
+          <w:cantSplit w:val="true"/>
+        </w:trPr>
         <w:tc>
           <w:tcPr>
             <w:tcW w:type="dxa" w:w="2381"/>
@@ -3198,6 +3309,9 @@
         </w:tc>
       </w:tr>
       <w:tr>
+        <w:trPr>
+          <w:cantSplit w:val="true"/>
+        </w:trPr>
         <w:tc>
           <w:tcPr>
             <w:tcW w:type="dxa" w:w="2381"/>
@@ -3270,6 +3384,9 @@
         <w:gridCol w:w="4873"/>
       </w:tblGrid>
       <w:tr>
+        <w:trPr>
+          <w:cantSplit w:val="true"/>
+        </w:trPr>
         <w:tc>
           <w:tcPr>
             <w:tcW w:type="dxa" w:w="2381"/>
@@ -3315,6 +3432,9 @@
         </w:tc>
       </w:tr>
       <w:tr>
+        <w:trPr>
+          <w:cantSplit w:val="true"/>
+        </w:trPr>
         <w:tc>
           <w:tcPr>
             <w:tcW w:type="dxa" w:w="2381"/>
@@ -3360,6 +3480,9 @@
         </w:tc>
       </w:tr>
       <w:tr>
+        <w:trPr>
+          <w:cantSplit w:val="true"/>
+        </w:trPr>
         <w:tc>
           <w:tcPr>
             <w:tcW w:type="dxa" w:w="2381"/>
@@ -3399,12 +3522,15 @@
                 <w:b w:val="0"/>
                 <w:sz w:val="19"/>
               </w:rPr>
-              <w:t>Chromium 141 · Linux · Railway/local, commit 693358a</w:t>
+              <w:t>Chromium 141.0.7390.37 · Linux · ConectaProfe en copia local del commit 693358a, la misma versión desplegada en Railway · ejecución automatizada con Playwright el 07/10/2026</w:t>
             </w:r>
           </w:p>
         </w:tc>
       </w:tr>
       <w:tr>
+        <w:trPr>
+          <w:cantSplit w:val="true"/>
+        </w:trPr>
         <w:tc>
           <w:tcPr>
             <w:tcW w:type="dxa" w:w="2381"/>
@@ -3450,6 +3576,9 @@
         </w:tc>
       </w:tr>
       <w:tr>
+        <w:trPr>
+          <w:cantSplit w:val="true"/>
+        </w:trPr>
         <w:tc>
           <w:tcPr>
             <w:tcW w:type="dxa" w:w="2381"/>
@@ -3522,6 +3651,9 @@
         </w:tc>
       </w:tr>
       <w:tr>
+        <w:trPr>
+          <w:cantSplit w:val="true"/>
+        </w:trPr>
         <w:tc>
           <w:tcPr>
             <w:tcW w:type="dxa" w:w="2381"/>
@@ -3567,6 +3699,9 @@
         </w:tc>
       </w:tr>
       <w:tr>
+        <w:trPr>
+          <w:cantSplit w:val="true"/>
+        </w:trPr>
         <w:tc>
           <w:tcPr>
             <w:tcW w:type="dxa" w:w="2381"/>
@@ -3606,12 +3741,15 @@
                 <w:b w:val="0"/>
                 <w:sz w:val="19"/>
               </w:rPr>
-              <w:t>La asesoría con fecha de hoy (07/10/2026 18:11) se crea: POST → 200 {"mensaje":"Asesoría creada. Se notificó a Sandra Ríos Montoya y a Camilo Ríos Zapata.","tutoria_id":6}. Aparece en «Sesiones Programadas».</w:t>
+              <w:t>La asesoría con fecha de hoy (07/10/2026 19:10) se crea: POST → 200 {"mensaje":"Asesoría creada. Se notificó a Sandra Ríos Montoya y a Camilo Ríos Zapata.","tutoria_id":6}. Aparece en «Sesiones Programadas».</w:t>
             </w:r>
           </w:p>
         </w:tc>
       </w:tr>
       <w:tr>
+        <w:trPr>
+          <w:cantSplit w:val="true"/>
+        </w:trPr>
         <w:tc>
           <w:tcPr>
             <w:tcW w:type="dxa" w:w="2381"/>
@@ -3657,6 +3795,9 @@
         </w:tc>
       </w:tr>
       <w:tr>
+        <w:trPr>
+          <w:cantSplit w:val="true"/>
+        </w:trPr>
         <w:tc>
           <w:tcPr>
             <w:tcW w:type="dxa" w:w="2381"/>
@@ -3702,6 +3843,9 @@
         </w:tc>
       </w:tr>
       <w:tr>
+        <w:trPr>
+          <w:cantSplit w:val="true"/>
+        </w:trPr>
         <w:tc>
           <w:tcPr>
             <w:tcW w:type="dxa" w:w="2381"/>
@@ -3747,6 +3891,9 @@
         </w:tc>
       </w:tr>
       <w:tr>
+        <w:trPr>
+          <w:cantSplit w:val="true"/>
+        </w:trPr>
         <w:tc>
           <w:tcPr>
             <w:tcW w:type="dxa" w:w="2381"/>
@@ -3786,12 +3933,15 @@
                 <w:b w:val="0"/>
                 <w:sz w:val="19"/>
               </w:rPr>
-              <w:t>EV-CP032-C1-01.png</w:t>
+              <w:t>EV-CP032-C1-01.png (Anexo G, figura 11)</w:t>
             </w:r>
           </w:p>
         </w:tc>
       </w:tr>
       <w:tr>
+        <w:trPr>
+          <w:cantSplit w:val="true"/>
+        </w:trPr>
         <w:tc>
           <w:tcPr>
             <w:tcW w:type="dxa" w:w="2381"/>
@@ -3837,6 +3987,9 @@
         </w:tc>
       </w:tr>
       <w:tr>
+        <w:trPr>
+          <w:cantSplit w:val="true"/>
+        </w:trPr>
         <w:tc>
           <w:tcPr>
             <w:tcW w:type="dxa" w:w="2381"/>
@@ -3909,6 +4062,9 @@
         <w:gridCol w:w="4873"/>
       </w:tblGrid>
       <w:tr>
+        <w:trPr>
+          <w:cantSplit w:val="true"/>
+        </w:trPr>
         <w:tc>
           <w:tcPr>
             <w:tcW w:type="dxa" w:w="2381"/>
@@ -3954,6 +4110,9 @@
         </w:tc>
       </w:tr>
       <w:tr>
+        <w:trPr>
+          <w:cantSplit w:val="true"/>
+        </w:trPr>
         <w:tc>
           <w:tcPr>
             <w:tcW w:type="dxa" w:w="2381"/>
@@ -3999,6 +4158,9 @@
         </w:tc>
       </w:tr>
       <w:tr>
+        <w:trPr>
+          <w:cantSplit w:val="true"/>
+        </w:trPr>
         <w:tc>
           <w:tcPr>
             <w:tcW w:type="dxa" w:w="2381"/>
@@ -4038,12 +4200,15 @@
                 <w:b w:val="0"/>
                 <w:sz w:val="19"/>
               </w:rPr>
-              <w:t>Chromium 141 · Linux · Railway/local, commit 693358a</w:t>
+              <w:t>Chromium 141.0.7390.37 · Linux · ConectaProfe en copia local del commit 693358a, la misma versión desplegada en Railway · ejecución automatizada con Playwright el 07/10/2026</w:t>
             </w:r>
           </w:p>
         </w:tc>
       </w:tr>
       <w:tr>
+        <w:trPr>
+          <w:cantSplit w:val="true"/>
+        </w:trPr>
         <w:tc>
           <w:tcPr>
             <w:tcW w:type="dxa" w:w="2381"/>
@@ -4089,6 +4254,9 @@
         </w:tc>
       </w:tr>
       <w:tr>
+        <w:trPr>
+          <w:cantSplit w:val="true"/>
+        </w:trPr>
         <w:tc>
           <w:tcPr>
             <w:tcW w:type="dxa" w:w="2381"/>
@@ -4152,6 +4320,9 @@
         </w:tc>
       </w:tr>
       <w:tr>
+        <w:trPr>
+          <w:cantSplit w:val="true"/>
+        </w:trPr>
         <w:tc>
           <w:tcPr>
             <w:tcW w:type="dxa" w:w="2381"/>
@@ -4197,6 +4368,9 @@
         </w:tc>
       </w:tr>
       <w:tr>
+        <w:trPr>
+          <w:cantSplit w:val="true"/>
+        </w:trPr>
         <w:tc>
           <w:tcPr>
             <w:tcW w:type="dxa" w:w="2381"/>
@@ -4236,12 +4410,15 @@
                 <w:b w:val="0"/>
                 <w:sz w:val="19"/>
               </w:rPr>
-              <w:t>La tutoría #2 se canceló (estado «cancelada»). El docente ejecutó PATCH /api/tutorias/2/realizada: respuesta {"mensaje":"Tutoría completada"} y la tutoría quedó en «completada». Una tutoría cancelada no debería admitir nuevas transiciones.</w:t>
+              <w:t>La tutoría #16 se canceló (estado «cancelada»). El docente ejecutó PATCH /api/tutorias/16/realizada: respuesta {"mensaje":"Tutoría completada"} y la tutoría quedó en «completada». Una tutoría cancelada no debería admitir nuevas transiciones.</w:t>
             </w:r>
           </w:p>
         </w:tc>
       </w:tr>
       <w:tr>
+        <w:trPr>
+          <w:cantSplit w:val="true"/>
+        </w:trPr>
         <w:tc>
           <w:tcPr>
             <w:tcW w:type="dxa" w:w="2381"/>
@@ -4287,6 +4464,9 @@
         </w:tc>
       </w:tr>
       <w:tr>
+        <w:trPr>
+          <w:cantSplit w:val="true"/>
+        </w:trPr>
         <w:tc>
           <w:tcPr>
             <w:tcW w:type="dxa" w:w="2381"/>
@@ -4332,6 +4512,9 @@
         </w:tc>
       </w:tr>
       <w:tr>
+        <w:trPr>
+          <w:cantSplit w:val="true"/>
+        </w:trPr>
         <w:tc>
           <w:tcPr>
             <w:tcW w:type="dxa" w:w="2381"/>
@@ -4377,6 +4560,9 @@
         </w:tc>
       </w:tr>
       <w:tr>
+        <w:trPr>
+          <w:cantSplit w:val="true"/>
+        </w:trPr>
         <w:tc>
           <w:tcPr>
             <w:tcW w:type="dxa" w:w="2381"/>
@@ -4416,12 +4602,15 @@
                 <w:b w:val="0"/>
                 <w:sz w:val="19"/>
               </w:rPr>
-              <w:t>EV-DEF06-C1-01.png, EV-DEF06-CONSOLA.png</w:t>
+              <w:t>EV-DEF06-C1-01.png, EV-DEF06-C1-02.png, EV-DEF06-C1-03.png (Anexo G, figuras 12 a 14); EV-DEF06-CONSOLA.png (Anexo F, figura 5, consola F12)</w:t>
             </w:r>
           </w:p>
         </w:tc>
       </w:tr>
       <w:tr>
+        <w:trPr>
+          <w:cantSplit w:val="true"/>
+        </w:trPr>
         <w:tc>
           <w:tcPr>
             <w:tcW w:type="dxa" w:w="2381"/>
@@ -4467,6 +4656,9 @@
         </w:tc>
       </w:tr>
       <w:tr>
+        <w:trPr>
+          <w:cantSplit w:val="true"/>
+        </w:trPr>
         <w:tc>
           <w:tcPr>
             <w:tcW w:type="dxa" w:w="2381"/>
@@ -4539,6 +4731,9 @@
         <w:gridCol w:w="4873"/>
       </w:tblGrid>
       <w:tr>
+        <w:trPr>
+          <w:cantSplit w:val="true"/>
+        </w:trPr>
         <w:tc>
           <w:tcPr>
             <w:tcW w:type="dxa" w:w="2381"/>
@@ -4584,6 +4779,9 @@
         </w:tc>
       </w:tr>
       <w:tr>
+        <w:trPr>
+          <w:cantSplit w:val="true"/>
+        </w:trPr>
         <w:tc>
           <w:tcPr>
             <w:tcW w:type="dxa" w:w="2381"/>
@@ -4629,6 +4827,9 @@
         </w:tc>
       </w:tr>
       <w:tr>
+        <w:trPr>
+          <w:cantSplit w:val="true"/>
+        </w:trPr>
         <w:tc>
           <w:tcPr>
             <w:tcW w:type="dxa" w:w="2381"/>
@@ -4668,12 +4869,15 @@
                 <w:b w:val="0"/>
                 <w:sz w:val="19"/>
               </w:rPr>
-              <w:t>Chromium 141 · Linux · Railway/local, commit 693358a</w:t>
+              <w:t>Chromium 141.0.7390.37 · Linux · ConectaProfe en copia local del commit 693358a, la misma versión desplegada en Railway · ejecución automatizada con Playwright el 07/10/2026</w:t>
             </w:r>
           </w:p>
         </w:tc>
       </w:tr>
       <w:tr>
+        <w:trPr>
+          <w:cantSplit w:val="true"/>
+        </w:trPr>
         <w:tc>
           <w:tcPr>
             <w:tcW w:type="dxa" w:w="2381"/>
@@ -4719,6 +4923,9 @@
         </w:tc>
       </w:tr>
       <w:tr>
+        <w:trPr>
+          <w:cantSplit w:val="true"/>
+        </w:trPr>
         <w:tc>
           <w:tcPr>
             <w:tcW w:type="dxa" w:w="2381"/>
@@ -4782,6 +4989,9 @@
         </w:tc>
       </w:tr>
       <w:tr>
+        <w:trPr>
+          <w:cantSplit w:val="true"/>
+        </w:trPr>
         <w:tc>
           <w:tcPr>
             <w:tcW w:type="dxa" w:w="2381"/>
@@ -4827,6 +5037,9 @@
         </w:tc>
       </w:tr>
       <w:tr>
+        <w:trPr>
+          <w:cantSplit w:val="true"/>
+        </w:trPr>
         <w:tc>
           <w:tcPr>
             <w:tcW w:type="dxa" w:w="2381"/>
@@ -4872,6 +5085,9 @@
         </w:tc>
       </w:tr>
       <w:tr>
+        <w:trPr>
+          <w:cantSplit w:val="true"/>
+        </w:trPr>
         <w:tc>
           <w:tcPr>
             <w:tcW w:type="dxa" w:w="2381"/>
@@ -4917,6 +5133,9 @@
         </w:tc>
       </w:tr>
       <w:tr>
+        <w:trPr>
+          <w:cantSplit w:val="true"/>
+        </w:trPr>
         <w:tc>
           <w:tcPr>
             <w:tcW w:type="dxa" w:w="2381"/>
@@ -4962,6 +5181,9 @@
         </w:tc>
       </w:tr>
       <w:tr>
+        <w:trPr>
+          <w:cantSplit w:val="true"/>
+        </w:trPr>
         <w:tc>
           <w:tcPr>
             <w:tcW w:type="dxa" w:w="2381"/>
@@ -5007,6 +5229,9 @@
         </w:tc>
       </w:tr>
       <w:tr>
+        <w:trPr>
+          <w:cantSplit w:val="true"/>
+        </w:trPr>
         <w:tc>
           <w:tcPr>
             <w:tcW w:type="dxa" w:w="2381"/>
@@ -5046,12 +5271,15 @@
                 <w:b w:val="0"/>
                 <w:sz w:val="19"/>
               </w:rPr>
-              <w:t>EV-DEF07-C1-01.png</w:t>
+              <w:t>EV-DEF07-C1-01.png (Anexo G, figura 15)</w:t>
             </w:r>
           </w:p>
         </w:tc>
       </w:tr>
       <w:tr>
+        <w:trPr>
+          <w:cantSplit w:val="true"/>
+        </w:trPr>
         <w:tc>
           <w:tcPr>
             <w:tcW w:type="dxa" w:w="2381"/>
@@ -5097,6 +5325,9 @@
         </w:tc>
       </w:tr>
       <w:tr>
+        <w:trPr>
+          <w:cantSplit w:val="true"/>
+        </w:trPr>
         <w:tc>
           <w:tcPr>
             <w:tcW w:type="dxa" w:w="2381"/>
@@ -5169,6 +5400,9 @@
         <w:gridCol w:w="4873"/>
       </w:tblGrid>
       <w:tr>
+        <w:trPr>
+          <w:cantSplit w:val="true"/>
+        </w:trPr>
         <w:tc>
           <w:tcPr>
             <w:tcW w:type="dxa" w:w="2381"/>
@@ -5214,6 +5448,9 @@
         </w:tc>
       </w:tr>
       <w:tr>
+        <w:trPr>
+          <w:cantSplit w:val="true"/>
+        </w:trPr>
         <w:tc>
           <w:tcPr>
             <w:tcW w:type="dxa" w:w="2381"/>
@@ -5259,6 +5496,9 @@
         </w:tc>
       </w:tr>
       <w:tr>
+        <w:trPr>
+          <w:cantSplit w:val="true"/>
+        </w:trPr>
         <w:tc>
           <w:tcPr>
             <w:tcW w:type="dxa" w:w="2381"/>
@@ -5298,12 +5538,15 @@
                 <w:b w:val="0"/>
                 <w:sz w:val="19"/>
               </w:rPr>
-              <w:t>Chromium 141 · Linux · Railway/local, commit 693358a</w:t>
+              <w:t>Chromium 141.0.7390.37 · Linux · ConectaProfe en copia local del commit 693358a, la misma versión desplegada en Railway · ejecución automatizada con Playwright el 07/10/2026</w:t>
             </w:r>
           </w:p>
         </w:tc>
       </w:tr>
       <w:tr>
+        <w:trPr>
+          <w:cantSplit w:val="true"/>
+        </w:trPr>
         <w:tc>
           <w:tcPr>
             <w:tcW w:type="dxa" w:w="2381"/>
@@ -5349,6 +5592,9 @@
         </w:tc>
       </w:tr>
       <w:tr>
+        <w:trPr>
+          <w:cantSplit w:val="true"/>
+        </w:trPr>
         <w:tc>
           <w:tcPr>
             <w:tcW w:type="dxa" w:w="2381"/>
@@ -5412,6 +5658,9 @@
         </w:tc>
       </w:tr>
       <w:tr>
+        <w:trPr>
+          <w:cantSplit w:val="true"/>
+        </w:trPr>
         <w:tc>
           <w:tcPr>
             <w:tcW w:type="dxa" w:w="2381"/>
@@ -5457,6 +5706,9 @@
         </w:tc>
       </w:tr>
       <w:tr>
+        <w:trPr>
+          <w:cantSplit w:val="true"/>
+        </w:trPr>
         <w:tc>
           <w:tcPr>
             <w:tcW w:type="dxa" w:w="2381"/>
@@ -5496,12 +5748,15 @@
                 <w:b w:val="0"/>
                 <w:sz w:val="19"/>
               </w:rPr>
-              <w:t>Preparación: tutoría con Laura Vargas Suárez el 08/10/2026 a las 18:13 (201); al pulsar «Cancelar» faltaban 26.0 h reales. PATCH → 400 {"error":"Faltan 21h para la tutoría y se requieren 24h de anticipación para cancelar (RN03). Escríbele al docente."}; la tarjeta queda «Pendiente». En pantalla: el elemento #tostada tiene el texto «Faltan 21h para la tutoría y se requieren 24h de anticipación para cancelar (RN03). Escríbele al docente.» y las clases «tostada tostada--visible tostada--error», con opacidad calculada 0.</w:t>
+              <w:t>Preparación: tutoría con Laura Vargas Suárez el 08/10/2026 a las 19:12 (201); al pulsar «Cancelar» faltaban 26.0 h reales. PATCH → 400 {"error":"Faltan 21h para la tutoría y se requieren 24h de anticipación para cancelar (RN03). Escríbele al docente."}; la tarjeta queda «Pendiente». En pantalla: el elemento #tostada tiene el texto «Faltan 21h para la tutoría y se requieren 24h de anticipación para cancelar (RN03). Escríbele al docente.» y las clases «tostada tostada--visible tostada--error», con opacidad calculada 0.</w:t>
             </w:r>
           </w:p>
         </w:tc>
       </w:tr>
       <w:tr>
+        <w:trPr>
+          <w:cantSplit w:val="true"/>
+        </w:trPr>
         <w:tc>
           <w:tcPr>
             <w:tcW w:type="dxa" w:w="2381"/>
@@ -5547,6 +5802,9 @@
         </w:tc>
       </w:tr>
       <w:tr>
+        <w:trPr>
+          <w:cantSplit w:val="true"/>
+        </w:trPr>
         <w:tc>
           <w:tcPr>
             <w:tcW w:type="dxa" w:w="2381"/>
@@ -5592,6 +5850,9 @@
         </w:tc>
       </w:tr>
       <w:tr>
+        <w:trPr>
+          <w:cantSplit w:val="true"/>
+        </w:trPr>
         <w:tc>
           <w:tcPr>
             <w:tcW w:type="dxa" w:w="2381"/>
@@ -5637,6 +5898,9 @@
         </w:tc>
       </w:tr>
       <w:tr>
+        <w:trPr>
+          <w:cantSplit w:val="true"/>
+        </w:trPr>
         <w:tc>
           <w:tcPr>
             <w:tcW w:type="dxa" w:w="2381"/>
@@ -5676,12 +5940,15 @@
                 <w:b w:val="0"/>
                 <w:sz w:val="19"/>
               </w:rPr>
-              <w:t>EV-CP025-C1-01.png</w:t>
+              <w:t>EV-CP025-C1-01.png (Anexo G, figura 16)</w:t>
             </w:r>
           </w:p>
         </w:tc>
       </w:tr>
       <w:tr>
+        <w:trPr>
+          <w:cantSplit w:val="true"/>
+        </w:trPr>
         <w:tc>
           <w:tcPr>
             <w:tcW w:type="dxa" w:w="2381"/>
@@ -5727,6 +5994,9 @@
         </w:tc>
       </w:tr>
       <w:tr>
+        <w:trPr>
+          <w:cantSplit w:val="true"/>
+        </w:trPr>
         <w:tc>
           <w:tcPr>
             <w:tcW w:type="dxa" w:w="2381"/>
@@ -5799,6 +6069,9 @@
         <w:gridCol w:w="4873"/>
       </w:tblGrid>
       <w:tr>
+        <w:trPr>
+          <w:cantSplit w:val="true"/>
+        </w:trPr>
         <w:tc>
           <w:tcPr>
             <w:tcW w:type="dxa" w:w="2381"/>
@@ -5844,6 +6117,9 @@
         </w:tc>
       </w:tr>
       <w:tr>
+        <w:trPr>
+          <w:cantSplit w:val="true"/>
+        </w:trPr>
         <w:tc>
           <w:tcPr>
             <w:tcW w:type="dxa" w:w="2381"/>
@@ -5889,6 +6165,9 @@
         </w:tc>
       </w:tr>
       <w:tr>
+        <w:trPr>
+          <w:cantSplit w:val="true"/>
+        </w:trPr>
         <w:tc>
           <w:tcPr>
             <w:tcW w:type="dxa" w:w="2381"/>
@@ -5928,12 +6207,15 @@
                 <w:b w:val="0"/>
                 <w:sz w:val="19"/>
               </w:rPr>
-              <w:t>Chromium 141 · Linux · Railway/local, commit 693358a</w:t>
+              <w:t>Chromium 141.0.7390.37 · Linux · ConectaProfe en copia local del commit 693358a, la misma versión desplegada en Railway · ejecución automatizada con Playwright el 07/10/2026</w:t>
             </w:r>
           </w:p>
         </w:tc>
       </w:tr>
       <w:tr>
+        <w:trPr>
+          <w:cantSplit w:val="true"/>
+        </w:trPr>
         <w:tc>
           <w:tcPr>
             <w:tcW w:type="dxa" w:w="2381"/>
@@ -5979,6 +6261,9 @@
         </w:tc>
       </w:tr>
       <w:tr>
+        <w:trPr>
+          <w:cantSplit w:val="true"/>
+        </w:trPr>
         <w:tc>
           <w:tcPr>
             <w:tcW w:type="dxa" w:w="2381"/>
@@ -6042,6 +6327,9 @@
         </w:tc>
       </w:tr>
       <w:tr>
+        <w:trPr>
+          <w:cantSplit w:val="true"/>
+        </w:trPr>
         <w:tc>
           <w:tcPr>
             <w:tcW w:type="dxa" w:w="2381"/>
@@ -6087,6 +6375,9 @@
         </w:tc>
       </w:tr>
       <w:tr>
+        <w:trPr>
+          <w:cantSplit w:val="true"/>
+        </w:trPr>
         <w:tc>
           <w:tcPr>
             <w:tcW w:type="dxa" w:w="2381"/>
@@ -6132,6 +6423,9 @@
         </w:tc>
       </w:tr>
       <w:tr>
+        <w:trPr>
+          <w:cantSplit w:val="true"/>
+        </w:trPr>
         <w:tc>
           <w:tcPr>
             <w:tcW w:type="dxa" w:w="2381"/>
@@ -6177,6 +6471,9 @@
         </w:tc>
       </w:tr>
       <w:tr>
+        <w:trPr>
+          <w:cantSplit w:val="true"/>
+        </w:trPr>
         <w:tc>
           <w:tcPr>
             <w:tcW w:type="dxa" w:w="2381"/>
@@ -6222,6 +6519,9 @@
         </w:tc>
       </w:tr>
       <w:tr>
+        <w:trPr>
+          <w:cantSplit w:val="true"/>
+        </w:trPr>
         <w:tc>
           <w:tcPr>
             <w:tcW w:type="dxa" w:w="2381"/>
@@ -6267,6 +6567,9 @@
         </w:tc>
       </w:tr>
       <w:tr>
+        <w:trPr>
+          <w:cantSplit w:val="true"/>
+        </w:trPr>
         <w:tc>
           <w:tcPr>
             <w:tcW w:type="dxa" w:w="2381"/>
@@ -6306,12 +6609,15 @@
                 <w:b w:val="0"/>
                 <w:sz w:val="19"/>
               </w:rPr>
-              <w:t>EV-CP031-C1-01.png, EV-CP031-C1-02.png, EV-CP031-C1-03.png</w:t>
+              <w:t>EV-CP031-C1-01.png, EV-CP031-C1-02.png, EV-CP031-C1-03.png (Anexo G, figuras 17 a 19)</w:t>
             </w:r>
           </w:p>
         </w:tc>
       </w:tr>
       <w:tr>
+        <w:trPr>
+          <w:cantSplit w:val="true"/>
+        </w:trPr>
         <w:tc>
           <w:tcPr>
             <w:tcW w:type="dxa" w:w="2381"/>
@@ -6357,6 +6663,9 @@
         </w:tc>
       </w:tr>
       <w:tr>
+        <w:trPr>
+          <w:cantSplit w:val="true"/>
+        </w:trPr>
         <w:tc>
           <w:tcPr>
             <w:tcW w:type="dxa" w:w="2381"/>
@@ -6429,6 +6738,9 @@
         <w:gridCol w:w="4873"/>
       </w:tblGrid>
       <w:tr>
+        <w:trPr>
+          <w:cantSplit w:val="true"/>
+        </w:trPr>
         <w:tc>
           <w:tcPr>
             <w:tcW w:type="dxa" w:w="2381"/>
@@ -6474,6 +6786,9 @@
         </w:tc>
       </w:tr>
       <w:tr>
+        <w:trPr>
+          <w:cantSplit w:val="true"/>
+        </w:trPr>
         <w:tc>
           <w:tcPr>
             <w:tcW w:type="dxa" w:w="2381"/>
@@ -6519,6 +6834,9 @@
         </w:tc>
       </w:tr>
       <w:tr>
+        <w:trPr>
+          <w:cantSplit w:val="true"/>
+        </w:trPr>
         <w:tc>
           <w:tcPr>
             <w:tcW w:type="dxa" w:w="2381"/>
@@ -6558,12 +6876,15 @@
                 <w:b w:val="0"/>
                 <w:sz w:val="19"/>
               </w:rPr>
-              <w:t>Chromium 141 · Linux · Railway/local, commit 693358a</w:t>
+              <w:t>Chromium 141.0.7390.37 · Linux · ConectaProfe en copia local del commit 693358a, la misma versión desplegada en Railway · ejecución automatizada con Playwright el 07/10/2026</w:t>
             </w:r>
           </w:p>
         </w:tc>
       </w:tr>
       <w:tr>
+        <w:trPr>
+          <w:cantSplit w:val="true"/>
+        </w:trPr>
         <w:tc>
           <w:tcPr>
             <w:tcW w:type="dxa" w:w="2381"/>
@@ -6609,6 +6930,9 @@
         </w:tc>
       </w:tr>
       <w:tr>
+        <w:trPr>
+          <w:cantSplit w:val="true"/>
+        </w:trPr>
         <w:tc>
           <w:tcPr>
             <w:tcW w:type="dxa" w:w="2381"/>
@@ -6672,6 +6996,9 @@
         </w:tc>
       </w:tr>
       <w:tr>
+        <w:trPr>
+          <w:cantSplit w:val="true"/>
+        </w:trPr>
         <w:tc>
           <w:tcPr>
             <w:tcW w:type="dxa" w:w="2381"/>
@@ -6717,6 +7044,9 @@
         </w:tc>
       </w:tr>
       <w:tr>
+        <w:trPr>
+          <w:cantSplit w:val="true"/>
+        </w:trPr>
         <w:tc>
           <w:tcPr>
             <w:tcW w:type="dxa" w:w="2381"/>
@@ -6762,6 +7092,9 @@
         </w:tc>
       </w:tr>
       <w:tr>
+        <w:trPr>
+          <w:cantSplit w:val="true"/>
+        </w:trPr>
         <w:tc>
           <w:tcPr>
             <w:tcW w:type="dxa" w:w="2381"/>
@@ -6807,6 +7140,9 @@
         </w:tc>
       </w:tr>
       <w:tr>
+        <w:trPr>
+          <w:cantSplit w:val="true"/>
+        </w:trPr>
         <w:tc>
           <w:tcPr>
             <w:tcW w:type="dxa" w:w="2381"/>
@@ -6852,6 +7188,9 @@
         </w:tc>
       </w:tr>
       <w:tr>
+        <w:trPr>
+          <w:cantSplit w:val="true"/>
+        </w:trPr>
         <w:tc>
           <w:tcPr>
             <w:tcW w:type="dxa" w:w="2381"/>
@@ -6897,6 +7236,9 @@
         </w:tc>
       </w:tr>
       <w:tr>
+        <w:trPr>
+          <w:cantSplit w:val="true"/>
+        </w:trPr>
         <w:tc>
           <w:tcPr>
             <w:tcW w:type="dxa" w:w="2381"/>
@@ -6936,12 +7278,15 @@
                 <w:b w:val="0"/>
                 <w:sz w:val="19"/>
               </w:rPr>
-              <w:t>EV-CP016-C1-01.png</w:t>
+              <w:t>EV-CP016-C1-01.png, EV-CP024-C1-01.png (Anexo G, figuras 20 a 21); EV-DEF13-CONSOLA.png (Anexo F, figura 7, consola F12)</w:t>
             </w:r>
           </w:p>
         </w:tc>
       </w:tr>
       <w:tr>
+        <w:trPr>
+          <w:cantSplit w:val="true"/>
+        </w:trPr>
         <w:tc>
           <w:tcPr>
             <w:tcW w:type="dxa" w:w="2381"/>
@@ -6987,6 +7332,9 @@
         </w:tc>
       </w:tr>
       <w:tr>
+        <w:trPr>
+          <w:cantSplit w:val="true"/>
+        </w:trPr>
         <w:tc>
           <w:tcPr>
             <w:tcW w:type="dxa" w:w="2381"/>
@@ -7059,6 +7407,9 @@
         <w:gridCol w:w="4873"/>
       </w:tblGrid>
       <w:tr>
+        <w:trPr>
+          <w:cantSplit w:val="true"/>
+        </w:trPr>
         <w:tc>
           <w:tcPr>
             <w:tcW w:type="dxa" w:w="2381"/>
@@ -7104,6 +7455,9 @@
         </w:tc>
       </w:tr>
       <w:tr>
+        <w:trPr>
+          <w:cantSplit w:val="true"/>
+        </w:trPr>
         <w:tc>
           <w:tcPr>
             <w:tcW w:type="dxa" w:w="2381"/>
@@ -7149,6 +7503,9 @@
         </w:tc>
       </w:tr>
       <w:tr>
+        <w:trPr>
+          <w:cantSplit w:val="true"/>
+        </w:trPr>
         <w:tc>
           <w:tcPr>
             <w:tcW w:type="dxa" w:w="2381"/>
@@ -7188,12 +7545,15 @@
                 <w:b w:val="0"/>
                 <w:sz w:val="19"/>
               </w:rPr>
-              <w:t>Chromium 141 · Linux · Railway/local, commit 693358a</w:t>
+              <w:t>Chromium 141.0.7390.37 · Linux · ConectaProfe en copia local del commit 693358a, la misma versión desplegada en Railway · ejecución automatizada con Playwright el 07/10/2026</w:t>
             </w:r>
           </w:p>
         </w:tc>
       </w:tr>
       <w:tr>
+        <w:trPr>
+          <w:cantSplit w:val="true"/>
+        </w:trPr>
         <w:tc>
           <w:tcPr>
             <w:tcW w:type="dxa" w:w="2381"/>
@@ -7239,6 +7599,9 @@
         </w:tc>
       </w:tr>
       <w:tr>
+        <w:trPr>
+          <w:cantSplit w:val="true"/>
+        </w:trPr>
         <w:tc>
           <w:tcPr>
             <w:tcW w:type="dxa" w:w="2381"/>
@@ -7302,6 +7665,9 @@
         </w:tc>
       </w:tr>
       <w:tr>
+        <w:trPr>
+          <w:cantSplit w:val="true"/>
+        </w:trPr>
         <w:tc>
           <w:tcPr>
             <w:tcW w:type="dxa" w:w="2381"/>
@@ -7347,6 +7713,9 @@
         </w:tc>
       </w:tr>
       <w:tr>
+        <w:trPr>
+          <w:cantSplit w:val="true"/>
+        </w:trPr>
         <w:tc>
           <w:tcPr>
             <w:tcW w:type="dxa" w:w="2381"/>
@@ -7392,6 +7761,9 @@
         </w:tc>
       </w:tr>
       <w:tr>
+        <w:trPr>
+          <w:cantSplit w:val="true"/>
+        </w:trPr>
         <w:tc>
           <w:tcPr>
             <w:tcW w:type="dxa" w:w="2381"/>
@@ -7437,6 +7809,9 @@
         </w:tc>
       </w:tr>
       <w:tr>
+        <w:trPr>
+          <w:cantSplit w:val="true"/>
+        </w:trPr>
         <w:tc>
           <w:tcPr>
             <w:tcW w:type="dxa" w:w="2381"/>
@@ -7482,6 +7857,9 @@
         </w:tc>
       </w:tr>
       <w:tr>
+        <w:trPr>
+          <w:cantSplit w:val="true"/>
+        </w:trPr>
         <w:tc>
           <w:tcPr>
             <w:tcW w:type="dxa" w:w="2381"/>
@@ -7527,6 +7905,9 @@
         </w:tc>
       </w:tr>
       <w:tr>
+        <w:trPr>
+          <w:cantSplit w:val="true"/>
+        </w:trPr>
         <w:tc>
           <w:tcPr>
             <w:tcW w:type="dxa" w:w="2381"/>
@@ -7566,12 +7947,15 @@
                 <w:b w:val="0"/>
                 <w:sz w:val="19"/>
               </w:rPr>
-              <w:t>EV-DEF14-C1-01.png</w:t>
+              <w:t>EV-DEF14-C1-01.png, EV-DEF14-C1-02.png (Anexo G, figuras 22 a 23)</w:t>
             </w:r>
           </w:p>
         </w:tc>
       </w:tr>
       <w:tr>
+        <w:trPr>
+          <w:cantSplit w:val="true"/>
+        </w:trPr>
         <w:tc>
           <w:tcPr>
             <w:tcW w:type="dxa" w:w="2381"/>
@@ -7617,6 +8001,9 @@
         </w:tc>
       </w:tr>
       <w:tr>
+        <w:trPr>
+          <w:cantSplit w:val="true"/>
+        </w:trPr>
         <w:tc>
           <w:tcPr>
             <w:tcW w:type="dxa" w:w="2381"/>
@@ -7711,6 +8098,9 @@
         <w:gridCol w:w="1949"/>
       </w:tblGrid>
       <w:tr>
+        <w:trPr>
+          <w:cantSplit w:val="true"/>
+        </w:trPr>
         <w:tc>
           <w:tcPr>
             <w:tcW w:type="dxa" w:w="907"/>
@@ -7843,6 +8233,9 @@
         </w:tc>
       </w:tr>
       <w:tr>
+        <w:trPr>
+          <w:cantSplit w:val="true"/>
+        </w:trPr>
         <w:tc>
           <w:tcPr>
             <w:tcW w:type="dxa" w:w="907"/>
@@ -7950,6 +8343,9 @@
         </w:tc>
       </w:tr>
       <w:tr>
+        <w:trPr>
+          <w:cantSplit w:val="true"/>
+        </w:trPr>
         <w:tc>
           <w:tcPr>
             <w:tcW w:type="dxa" w:w="907"/>
@@ -8062,6 +8458,9 @@
         </w:tc>
       </w:tr>
       <w:tr>
+        <w:trPr>
+          <w:cantSplit w:val="true"/>
+        </w:trPr>
         <w:tc>
           <w:tcPr>
             <w:tcW w:type="dxa" w:w="907"/>
@@ -8169,6 +8568,9 @@
         </w:tc>
       </w:tr>
       <w:tr>
+        <w:trPr>
+          <w:cantSplit w:val="true"/>
+        </w:trPr>
         <w:tc>
           <w:tcPr>
             <w:tcW w:type="dxa" w:w="907"/>
@@ -8281,6 +8683,9 @@
         </w:tc>
       </w:tr>
       <w:tr>
+        <w:trPr>
+          <w:cantSplit w:val="true"/>
+        </w:trPr>
         <w:tc>
           <w:tcPr>
             <w:tcW w:type="dxa" w:w="907"/>
@@ -8388,6 +8793,9 @@
         </w:tc>
       </w:tr>
       <w:tr>
+        <w:trPr>
+          <w:cantSplit w:val="true"/>
+        </w:trPr>
         <w:tc>
           <w:tcPr>
             <w:tcW w:type="dxa" w:w="907"/>
@@ -8500,6 +8908,9 @@
         </w:tc>
       </w:tr>
       <w:tr>
+        <w:trPr>
+          <w:cantSplit w:val="true"/>
+        </w:trPr>
         <w:tc>
           <w:tcPr>
             <w:tcW w:type="dxa" w:w="907"/>
@@ -8607,6 +9018,9 @@
         </w:tc>
       </w:tr>
       <w:tr>
+        <w:trPr>
+          <w:cantSplit w:val="true"/>
+        </w:trPr>
         <w:tc>
           <w:tcPr>
             <w:tcW w:type="dxa" w:w="907"/>
@@ -8746,6 +9160,9 @@
         <w:gridCol w:w="4873"/>
       </w:tblGrid>
       <w:tr>
+        <w:trPr>
+          <w:cantSplit w:val="true"/>
+        </w:trPr>
         <w:tc>
           <w:tcPr>
             <w:tcW w:type="dxa" w:w="1701"/>
@@ -8800,6 +9217,9 @@
         </w:tc>
       </w:tr>
       <w:tr>
+        <w:trPr>
+          <w:cantSplit w:val="true"/>
+        </w:trPr>
         <w:tc>
           <w:tcPr>
             <w:tcW w:type="dxa" w:w="1701"/>
@@ -8844,6 +9264,9 @@
         </w:tc>
       </w:tr>
       <w:tr>
+        <w:trPr>
+          <w:cantSplit w:val="true"/>
+        </w:trPr>
         <w:tc>
           <w:tcPr>
             <w:tcW w:type="dxa" w:w="1701"/>
@@ -8890,6 +9313,9 @@
         </w:tc>
       </w:tr>
       <w:tr>
+        <w:trPr>
+          <w:cantSplit w:val="true"/>
+        </w:trPr>
         <w:tc>
           <w:tcPr>
             <w:tcW w:type="dxa" w:w="1701"/>
@@ -8934,6 +9360,9 @@
         </w:tc>
       </w:tr>
       <w:tr>
+        <w:trPr>
+          <w:cantSplit w:val="true"/>
+        </w:trPr>
         <w:tc>
           <w:tcPr>
             <w:tcW w:type="dxa" w:w="1701"/>
@@ -9021,6 +9450,9 @@
         <w:gridCol w:w="3249"/>
       </w:tblGrid>
       <w:tr>
+        <w:trPr>
+          <w:cantSplit w:val="true"/>
+        </w:trPr>
         <w:tc>
           <w:tcPr>
             <w:tcW w:type="dxa" w:w="567"/>
@@ -9101,6 +9533,9 @@
         </w:tc>
       </w:tr>
       <w:tr>
+        <w:trPr>
+          <w:cantSplit w:val="true"/>
+        </w:trPr>
         <w:tc>
           <w:tcPr>
             <w:tcW w:type="dxa" w:w="567"/>
@@ -9166,6 +9601,9 @@
         </w:tc>
       </w:tr>
       <w:tr>
+        <w:trPr>
+          <w:cantSplit w:val="true"/>
+        </w:trPr>
         <w:tc>
           <w:tcPr>
             <w:tcW w:type="dxa" w:w="567"/>
@@ -9234,6 +9672,9 @@
         </w:tc>
       </w:tr>
       <w:tr>
+        <w:trPr>
+          <w:cantSplit w:val="true"/>
+        </w:trPr>
         <w:tc>
           <w:tcPr>
             <w:tcW w:type="dxa" w:w="567"/>
@@ -9299,6 +9740,9 @@
         </w:tc>
       </w:tr>
       <w:tr>
+        <w:trPr>
+          <w:cantSplit w:val="true"/>
+        </w:trPr>
         <w:tc>
           <w:tcPr>
             <w:tcW w:type="dxa" w:w="567"/>
@@ -9367,6 +9811,9 @@
         </w:tc>
       </w:tr>
       <w:tr>
+        <w:trPr>
+          <w:cantSplit w:val="true"/>
+        </w:trPr>
         <w:tc>
           <w:tcPr>
             <w:tcW w:type="dxa" w:w="567"/>
@@ -9432,6 +9879,9 @@
         </w:tc>
       </w:tr>
       <w:tr>
+        <w:trPr>
+          <w:cantSplit w:val="true"/>
+        </w:trPr>
         <w:tc>
           <w:tcPr>
             <w:tcW w:type="dxa" w:w="567"/>
@@ -9500,6 +9950,9 @@
         </w:tc>
       </w:tr>
       <w:tr>
+        <w:trPr>
+          <w:cantSplit w:val="true"/>
+        </w:trPr>
         <w:tc>
           <w:tcPr>
             <w:tcW w:type="dxa" w:w="567"/>
@@ -9565,6 +10018,9 @@
         </w:tc>
       </w:tr>
       <w:tr>
+        <w:trPr>
+          <w:cantSplit w:val="true"/>
+        </w:trPr>
         <w:tc>
           <w:tcPr>
             <w:tcW w:type="dxa" w:w="567"/>
@@ -9633,6 +10089,9 @@
         </w:tc>
       </w:tr>
       <w:tr>
+        <w:trPr>
+          <w:cantSplit w:val="true"/>
+        </w:trPr>
         <w:tc>
           <w:tcPr>
             <w:tcW w:type="dxa" w:w="567"/>
@@ -9698,6 +10157,9 @@
         </w:tc>
       </w:tr>
       <w:tr>
+        <w:trPr>
+          <w:cantSplit w:val="true"/>
+        </w:trPr>
         <w:tc>
           <w:tcPr>
             <w:tcW w:type="dxa" w:w="567"/>
@@ -9766,6 +10228,9 @@
         </w:tc>
       </w:tr>
       <w:tr>
+        <w:trPr>
+          <w:cantSplit w:val="true"/>
+        </w:trPr>
         <w:tc>
           <w:tcPr>
             <w:tcW w:type="dxa" w:w="567"/>
@@ -9831,6 +10296,9 @@
         </w:tc>
       </w:tr>
       <w:tr>
+        <w:trPr>
+          <w:cantSplit w:val="true"/>
+        </w:trPr>
         <w:tc>
           <w:tcPr>
             <w:tcW w:type="dxa" w:w="567"/>
@@ -9917,7 +10385,7 @@
           <w:i w:val="0"/>
           <w:sz w:val="22"/>
         </w:rPr>
-        <w:t>Estas son las verificaciones que se hacen pegando un fetch() en la consola del navegador, con el token de la sesión. Prueban la capa del servidor directamente —control de acceso por rol, datos inexistentes y validaciones que el formulario no deja disparar— y son las más cercanas a cómo se tantea una API. Van con el comando exacto para copiar y pegar; las rutas son relativas, así que sirven igual en localhost y en Railway. En la sustentación, cualquiera del equipo puede reproducirlas en vivo.</w:t>
+        <w:t>Estas son las verificaciones que se hacen desde la consola del navegador (F12). Casi todas pegan un fetch() con el token de la sesión y prueban la capa del servidor directamente —control de acceso por rol, datos inexistentes y validaciones que el formulario no deja disparar—; la de DEF-13 inspecciona el elemento del mensaje emergente para ver lo que la pantalla no muestra. Van con el comando exacto para copiar y pegar y, debajo, la captura de la consola tal como quedó. Las rutas son relativas, así que sirven igual en localhost y en Railway; en la sustentación cualquiera del equipo puede reproducirlas en vivo.</w:t>
       </w:r>
     </w:p>
     <w:p>
@@ -9971,6 +10439,9 @@
         <w:gridCol w:w="9746"/>
       </w:tblGrid>
       <w:tr>
+        <w:trPr>
+          <w:cantSplit w:val="true"/>
+        </w:trPr>
         <w:tc>
           <w:tcPr>
             <w:tcW w:type="dxa" w:w="9746"/>
@@ -10069,6 +10540,9 @@
         <w:gridCol w:w="4873"/>
       </w:tblGrid>
       <w:tr>
+        <w:trPr>
+          <w:cantSplit w:val="true"/>
+        </w:trPr>
         <w:tc>
           <w:tcPr>
             <w:tcW w:type="dxa" w:w="2381"/>
@@ -10114,6 +10588,9 @@
         </w:tc>
       </w:tr>
       <w:tr>
+        <w:trPr>
+          <w:cantSplit w:val="true"/>
+        </w:trPr>
         <w:tc>
           <w:tcPr>
             <w:tcW w:type="dxa" w:w="2381"/>
@@ -10159,6 +10636,9 @@
         </w:tc>
       </w:tr>
       <w:tr>
+        <w:trPr>
+          <w:cantSplit w:val="true"/>
+        </w:trPr>
         <w:tc>
           <w:tcPr>
             <w:tcW w:type="dxa" w:w="2381"/>
@@ -10204,6 +10684,9 @@
         </w:tc>
       </w:tr>
       <w:tr>
+        <w:trPr>
+          <w:cantSplit w:val="true"/>
+        </w:trPr>
         <w:tc>
           <w:tcPr>
             <w:tcW w:type="dxa" w:w="2381"/>
@@ -10249,6 +10732,9 @@
         </w:tc>
       </w:tr>
       <w:tr>
+        <w:trPr>
+          <w:cantSplit w:val="true"/>
+        </w:trPr>
         <w:tc>
           <w:tcPr>
             <w:tcW w:type="dxa" w:w="2381"/>
@@ -10294,6 +10780,9 @@
         </w:tc>
       </w:tr>
       <w:tr>
+        <w:trPr>
+          <w:cantSplit w:val="true"/>
+        </w:trPr>
         <w:tc>
           <w:tcPr>
             <w:tcW w:type="dxa" w:w="2381"/>
@@ -10333,12 +10822,74 @@
                 <w:b w:val="0"/>
                 <w:sz w:val="19"/>
               </w:rPr>
-              <w:t>EV-CP008-CONSOLA.png</w:t>
+              <w:t>EV-CP008-CONSOLA.png (figura 2, debajo)</w:t>
             </w:r>
           </w:p>
         </w:tc>
       </w:tr>
     </w:tbl>
+    <w:p>
+      <w:pPr>
+        <w:keepNext/>
+        <w:spacing w:before="80" w:after="40"/>
+        <w:jc w:val="center"/>
+      </w:pPr>
+      <w:r>
+        <w:drawing>
+          <wp:inline xmlns:a="http://schemas.openxmlformats.org/drawingml/2006/main" xmlns:pic="http://schemas.openxmlformats.org/drawingml/2006/picture">
+            <wp:extent cx="5580000" cy="3138750"/>
+            <wp:docPr id="2" name="Picture 2"/>
+            <wp:cNvGraphicFramePr>
+              <a:graphicFrameLocks noChangeAspect="1"/>
+            </wp:cNvGraphicFramePr>
+            <a:graphic>
+              <a:graphicData uri="http://schemas.openxmlformats.org/drawingml/2006/picture">
+                <pic:pic>
+                  <pic:nvPicPr>
+                    <pic:cNvPr id="0" name="EV-CP008-CONSOLA.jpg"/>
+                    <pic:cNvPicPr/>
+                  </pic:nvPicPr>
+                  <pic:blipFill>
+                    <a:blip r:embed="rId11"/>
+                    <a:stretch>
+                      <a:fillRect/>
+                    </a:stretch>
+                  </pic:blipFill>
+                  <pic:spPr>
+                    <a:xfrm>
+                      <a:off x="0" y="0"/>
+                      <a:ext cx="5580000" cy="3138750"/>
+                    </a:xfrm>
+                    <a:prstGeom prst="rect"/>
+                  </pic:spPr>
+                </pic:pic>
+              </a:graphicData>
+            </a:graphic>
+          </wp:inline>
+        </w:drawing>
+      </w:r>
+    </w:p>
+    <w:p>
+      <w:pPr>
+        <w:spacing w:after="200"/>
+        <w:jc w:val="center"/>
+      </w:pPr>
+      <w:r>
+        <w:rPr>
+          <w:b/>
+          <w:i/>
+          <w:sz w:val="18"/>
+        </w:rPr>
+        <w:t xml:space="preserve">Figura 2. </w:t>
+      </w:r>
+      <w:r>
+        <w:rPr>
+          <w:i/>
+          <w:sz w:val="18"/>
+        </w:rPr>
+        <w:t>CP-008 · EV-CP008-CONSOLA.png. Consola F12 con el comando ejecutado y la respuesta: rechazo de registro con rol de administrador.</w:t>
+      </w:r>
+    </w:p>
     <w:p/>
     <w:p>
       <w:pPr>
@@ -10391,6 +10942,9 @@
         <w:gridCol w:w="9746"/>
       </w:tblGrid>
       <w:tr>
+        <w:trPr>
+          <w:cantSplit w:val="true"/>
+        </w:trPr>
         <w:tc>
           <w:tcPr>
             <w:tcW w:type="dxa" w:w="9746"/>
@@ -10489,6 +11043,9 @@
         <w:gridCol w:w="4873"/>
       </w:tblGrid>
       <w:tr>
+        <w:trPr>
+          <w:cantSplit w:val="true"/>
+        </w:trPr>
         <w:tc>
           <w:tcPr>
             <w:tcW w:type="dxa" w:w="2381"/>
@@ -10534,6 +11091,9 @@
         </w:tc>
       </w:tr>
       <w:tr>
+        <w:trPr>
+          <w:cantSplit w:val="true"/>
+        </w:trPr>
         <w:tc>
           <w:tcPr>
             <w:tcW w:type="dxa" w:w="2381"/>
@@ -10579,6 +11139,9 @@
         </w:tc>
       </w:tr>
       <w:tr>
+        <w:trPr>
+          <w:cantSplit w:val="true"/>
+        </w:trPr>
         <w:tc>
           <w:tcPr>
             <w:tcW w:type="dxa" w:w="2381"/>
@@ -10624,6 +11187,9 @@
         </w:tc>
       </w:tr>
       <w:tr>
+        <w:trPr>
+          <w:cantSplit w:val="true"/>
+        </w:trPr>
         <w:tc>
           <w:tcPr>
             <w:tcW w:type="dxa" w:w="2381"/>
@@ -10669,6 +11235,9 @@
         </w:tc>
       </w:tr>
       <w:tr>
+        <w:trPr>
+          <w:cantSplit w:val="true"/>
+        </w:trPr>
         <w:tc>
           <w:tcPr>
             <w:tcW w:type="dxa" w:w="2381"/>
@@ -10714,6 +11283,9 @@
         </w:tc>
       </w:tr>
       <w:tr>
+        <w:trPr>
+          <w:cantSplit w:val="true"/>
+        </w:trPr>
         <w:tc>
           <w:tcPr>
             <w:tcW w:type="dxa" w:w="2381"/>
@@ -10753,12 +11325,74 @@
                 <w:b w:val="0"/>
                 <w:sz w:val="19"/>
               </w:rPr>
-              <w:t>EV-CP018-CONSOLA.png</w:t>
+              <w:t>EV-CP018-CONSOLA.png (figura 3, debajo)</w:t>
             </w:r>
           </w:p>
         </w:tc>
       </w:tr>
     </w:tbl>
+    <w:p>
+      <w:pPr>
+        <w:keepNext/>
+        <w:spacing w:before="80" w:after="40"/>
+        <w:jc w:val="center"/>
+      </w:pPr>
+      <w:r>
+        <w:drawing>
+          <wp:inline xmlns:a="http://schemas.openxmlformats.org/drawingml/2006/main" xmlns:pic="http://schemas.openxmlformats.org/drawingml/2006/picture">
+            <wp:extent cx="5580000" cy="3138750"/>
+            <wp:docPr id="3" name="Picture 3"/>
+            <wp:cNvGraphicFramePr>
+              <a:graphicFrameLocks noChangeAspect="1"/>
+            </wp:cNvGraphicFramePr>
+            <a:graphic>
+              <a:graphicData uri="http://schemas.openxmlformats.org/drawingml/2006/picture">
+                <pic:pic>
+                  <pic:nvPicPr>
+                    <pic:cNvPr id="0" name="EV-CP018-CONSOLA.jpg"/>
+                    <pic:cNvPicPr/>
+                  </pic:nvPicPr>
+                  <pic:blipFill>
+                    <a:blip r:embed="rId12"/>
+                    <a:stretch>
+                      <a:fillRect/>
+                    </a:stretch>
+                  </pic:blipFill>
+                  <pic:spPr>
+                    <a:xfrm>
+                      <a:off x="0" y="0"/>
+                      <a:ext cx="5580000" cy="3138750"/>
+                    </a:xfrm>
+                    <a:prstGeom prst="rect"/>
+                  </pic:spPr>
+                </pic:pic>
+              </a:graphicData>
+            </a:graphic>
+          </wp:inline>
+        </w:drawing>
+      </w:r>
+    </w:p>
+    <w:p>
+      <w:pPr>
+        <w:spacing w:after="200"/>
+        <w:jc w:val="center"/>
+      </w:pPr>
+      <w:r>
+        <w:rPr>
+          <w:b/>
+          <w:i/>
+          <w:sz w:val="18"/>
+        </w:rPr>
+        <w:t xml:space="preserve">Figura 3. </w:t>
+      </w:r>
+      <w:r>
+        <w:rPr>
+          <w:i/>
+          <w:sz w:val="18"/>
+        </w:rPr>
+        <w:t>CP-018 · EV-CP018-CONSOLA.png. Consola F12 con el comando ejecutado y la respuesta: un estudiante no puede guardar un perfil de docente.</w:t>
+      </w:r>
+    </w:p>
     <w:p/>
     <w:p>
       <w:pPr>
@@ -10811,6 +11445,9 @@
         <w:gridCol w:w="9746"/>
       </w:tblGrid>
       <w:tr>
+        <w:trPr>
+          <w:cantSplit w:val="true"/>
+        </w:trPr>
         <w:tc>
           <w:tcPr>
             <w:tcW w:type="dxa" w:w="9746"/>
@@ -10922,6 +11559,9 @@
         <w:gridCol w:w="4873"/>
       </w:tblGrid>
       <w:tr>
+        <w:trPr>
+          <w:cantSplit w:val="true"/>
+        </w:trPr>
         <w:tc>
           <w:tcPr>
             <w:tcW w:type="dxa" w:w="2381"/>
@@ -10967,6 +11607,9 @@
         </w:tc>
       </w:tr>
       <w:tr>
+        <w:trPr>
+          <w:cantSplit w:val="true"/>
+        </w:trPr>
         <w:tc>
           <w:tcPr>
             <w:tcW w:type="dxa" w:w="2381"/>
@@ -11012,6 +11655,9 @@
         </w:tc>
       </w:tr>
       <w:tr>
+        <w:trPr>
+          <w:cantSplit w:val="true"/>
+        </w:trPr>
         <w:tc>
           <w:tcPr>
             <w:tcW w:type="dxa" w:w="2381"/>
@@ -11057,6 +11703,9 @@
         </w:tc>
       </w:tr>
       <w:tr>
+        <w:trPr>
+          <w:cantSplit w:val="true"/>
+        </w:trPr>
         <w:tc>
           <w:tcPr>
             <w:tcW w:type="dxa" w:w="2381"/>
@@ -11102,6 +11751,9 @@
         </w:tc>
       </w:tr>
       <w:tr>
+        <w:trPr>
+          <w:cantSplit w:val="true"/>
+        </w:trPr>
         <w:tc>
           <w:tcPr>
             <w:tcW w:type="dxa" w:w="2381"/>
@@ -11147,6 +11799,9 @@
         </w:tc>
       </w:tr>
       <w:tr>
+        <w:trPr>
+          <w:cantSplit w:val="true"/>
+        </w:trPr>
         <w:tc>
           <w:tcPr>
             <w:tcW w:type="dxa" w:w="2381"/>
@@ -11186,12 +11841,74 @@
                 <w:b w:val="0"/>
                 <w:sz w:val="19"/>
               </w:rPr>
-              <w:t>EV-CP021-CONSOLA.png</w:t>
+              <w:t>EV-CP021-CONSOLA.png (figura 4, debajo)</w:t>
             </w:r>
           </w:p>
         </w:tc>
       </w:tr>
     </w:tbl>
+    <w:p>
+      <w:pPr>
+        <w:keepNext/>
+        <w:spacing w:before="80" w:after="40"/>
+        <w:jc w:val="center"/>
+      </w:pPr>
+      <w:r>
+        <w:drawing>
+          <wp:inline xmlns:a="http://schemas.openxmlformats.org/drawingml/2006/main" xmlns:pic="http://schemas.openxmlformats.org/drawingml/2006/picture">
+            <wp:extent cx="5580000" cy="3138750"/>
+            <wp:docPr id="4" name="Picture 4"/>
+            <wp:cNvGraphicFramePr>
+              <a:graphicFrameLocks noChangeAspect="1"/>
+            </wp:cNvGraphicFramePr>
+            <a:graphic>
+              <a:graphicData uri="http://schemas.openxmlformats.org/drawingml/2006/picture">
+                <pic:pic>
+                  <pic:nvPicPr>
+                    <pic:cNvPr id="0" name="EV-CP021-CONSOLA.jpg"/>
+                    <pic:cNvPicPr/>
+                  </pic:nvPicPr>
+                  <pic:blipFill>
+                    <a:blip r:embed="rId13"/>
+                    <a:stretch>
+                      <a:fillRect/>
+                    </a:stretch>
+                  </pic:blipFill>
+                  <pic:spPr>
+                    <a:xfrm>
+                      <a:off x="0" y="0"/>
+                      <a:ext cx="5580000" cy="3138750"/>
+                    </a:xfrm>
+                    <a:prstGeom prst="rect"/>
+                  </pic:spPr>
+                </pic:pic>
+              </a:graphicData>
+            </a:graphic>
+          </wp:inline>
+        </w:drawing>
+      </w:r>
+    </w:p>
+    <w:p>
+      <w:pPr>
+        <w:spacing w:after="200"/>
+        <w:jc w:val="center"/>
+      </w:pPr>
+      <w:r>
+        <w:rPr>
+          <w:b/>
+          <w:i/>
+          <w:sz w:val="18"/>
+        </w:rPr>
+        <w:t xml:space="preserve">Figura 4. </w:t>
+      </w:r>
+      <w:r>
+        <w:rPr>
+          <w:i/>
+          <w:sz w:val="18"/>
+        </w:rPr>
+        <w:t>CP-021 · EV-CP021-CONSOLA.png. Consola F12 con el comando ejecutado y la respuesta: rechazo de tutoría con docente inexistente.</w:t>
+      </w:r>
+    </w:p>
     <w:p/>
     <w:p>
       <w:pPr>
@@ -11244,6 +11961,9 @@
         <w:gridCol w:w="9746"/>
       </w:tblGrid>
       <w:tr>
+        <w:trPr>
+          <w:cantSplit w:val="true"/>
+        </w:trPr>
         <w:tc>
           <w:tcPr>
             <w:tcW w:type="dxa" w:w="9746"/>
@@ -11266,7 +11986,7 @@
                 <w:color w:val="E8EAED"/>
                 <w:sz w:val="18"/>
               </w:rPr>
-              <w:t>fetch("/api/tutorias/6/realizada",{method:"PATCH",headers:{Authorization:"Bearer "+localStorage.getItem("cp.token")}}).then(r=&gt;r.json()).then(console.log)</w:t>
+              <w:t>fetch("/api/tutorias/19/realizada",{method:"PATCH",headers:{Authorization:"Bearer "+localStorage.getItem("cp.token")}}).then(r=&gt;r.json()).then(console.log)</w:t>
             </w:r>
           </w:p>
         </w:tc>
@@ -11290,6 +12010,9 @@
         <w:gridCol w:w="4873"/>
       </w:tblGrid>
       <w:tr>
+        <w:trPr>
+          <w:cantSplit w:val="true"/>
+        </w:trPr>
         <w:tc>
           <w:tcPr>
             <w:tcW w:type="dxa" w:w="2381"/>
@@ -11335,6 +12058,9 @@
         </w:tc>
       </w:tr>
       <w:tr>
+        <w:trPr>
+          <w:cantSplit w:val="true"/>
+        </w:trPr>
         <w:tc>
           <w:tcPr>
             <w:tcW w:type="dxa" w:w="2381"/>
@@ -11380,6 +12106,9 @@
         </w:tc>
       </w:tr>
       <w:tr>
+        <w:trPr>
+          <w:cantSplit w:val="true"/>
+        </w:trPr>
         <w:tc>
           <w:tcPr>
             <w:tcW w:type="dxa" w:w="2381"/>
@@ -11425,6 +12154,9 @@
         </w:tc>
       </w:tr>
       <w:tr>
+        <w:trPr>
+          <w:cantSplit w:val="true"/>
+        </w:trPr>
         <w:tc>
           <w:tcPr>
             <w:tcW w:type="dxa" w:w="2381"/>
@@ -11470,6 +12202,9 @@
         </w:tc>
       </w:tr>
       <w:tr>
+        <w:trPr>
+          <w:cantSplit w:val="true"/>
+        </w:trPr>
         <w:tc>
           <w:tcPr>
             <w:tcW w:type="dxa" w:w="2381"/>
@@ -11515,6 +12250,9 @@
         </w:tc>
       </w:tr>
       <w:tr>
+        <w:trPr>
+          <w:cantSplit w:val="true"/>
+        </w:trPr>
         <w:tc>
           <w:tcPr>
             <w:tcW w:type="dxa" w:w="2381"/>
@@ -11554,12 +12292,74 @@
                 <w:b w:val="0"/>
                 <w:sz w:val="19"/>
               </w:rPr>
-              <w:t>EV-DEF06-CONSOLA.png</w:t>
+              <w:t>EV-DEF06-CONSOLA.png (figura 5, debajo)</w:t>
             </w:r>
           </w:p>
         </w:tc>
       </w:tr>
     </w:tbl>
+    <w:p>
+      <w:pPr>
+        <w:keepNext/>
+        <w:spacing w:before="80" w:after="40"/>
+        <w:jc w:val="center"/>
+      </w:pPr>
+      <w:r>
+        <w:drawing>
+          <wp:inline xmlns:a="http://schemas.openxmlformats.org/drawingml/2006/main" xmlns:pic="http://schemas.openxmlformats.org/drawingml/2006/picture">
+            <wp:extent cx="5580000" cy="3138750"/>
+            <wp:docPr id="5" name="Picture 5"/>
+            <wp:cNvGraphicFramePr>
+              <a:graphicFrameLocks noChangeAspect="1"/>
+            </wp:cNvGraphicFramePr>
+            <a:graphic>
+              <a:graphicData uri="http://schemas.openxmlformats.org/drawingml/2006/picture">
+                <pic:pic>
+                  <pic:nvPicPr>
+                    <pic:cNvPr id="0" name="EV-DEF06-CONSOLA.jpg"/>
+                    <pic:cNvPicPr/>
+                  </pic:nvPicPr>
+                  <pic:blipFill>
+                    <a:blip r:embed="rId14"/>
+                    <a:stretch>
+                      <a:fillRect/>
+                    </a:stretch>
+                  </pic:blipFill>
+                  <pic:spPr>
+                    <a:xfrm>
+                      <a:off x="0" y="0"/>
+                      <a:ext cx="5580000" cy="3138750"/>
+                    </a:xfrm>
+                    <a:prstGeom prst="rect"/>
+                  </pic:spPr>
+                </pic:pic>
+              </a:graphicData>
+            </a:graphic>
+          </wp:inline>
+        </w:drawing>
+      </w:r>
+    </w:p>
+    <w:p>
+      <w:pPr>
+        <w:spacing w:after="200"/>
+        <w:jc w:val="center"/>
+      </w:pPr>
+      <w:r>
+        <w:rPr>
+          <w:b/>
+          <w:i/>
+          <w:sz w:val="18"/>
+        </w:rPr>
+        <w:t xml:space="preserve">Figura 5. </w:t>
+      </w:r>
+      <w:r>
+        <w:rPr>
+          <w:i/>
+          <w:sz w:val="18"/>
+        </w:rPr>
+        <w:t>DEF-06 · EV-DEF06-CONSOLA.png. Consola F12 con el comando ejecutado y la respuesta: una tutoría cancelada se marca «completada» por la api.</w:t>
+      </w:r>
+    </w:p>
     <w:p/>
     <w:p>
       <w:pPr>
@@ -11612,6 +12412,9 @@
         <w:gridCol w:w="9746"/>
       </w:tblGrid>
       <w:tr>
+        <w:trPr>
+          <w:cantSplit w:val="true"/>
+        </w:trPr>
         <w:tc>
           <w:tcPr>
             <w:tcW w:type="dxa" w:w="9746"/>
@@ -11723,6 +12526,9 @@
         <w:gridCol w:w="4873"/>
       </w:tblGrid>
       <w:tr>
+        <w:trPr>
+          <w:cantSplit w:val="true"/>
+        </w:trPr>
         <w:tc>
           <w:tcPr>
             <w:tcW w:type="dxa" w:w="2381"/>
@@ -11768,6 +12574,9 @@
         </w:tc>
       </w:tr>
       <w:tr>
+        <w:trPr>
+          <w:cantSplit w:val="true"/>
+        </w:trPr>
         <w:tc>
           <w:tcPr>
             <w:tcW w:type="dxa" w:w="2381"/>
@@ -11813,6 +12622,9 @@
         </w:tc>
       </w:tr>
       <w:tr>
+        <w:trPr>
+          <w:cantSplit w:val="true"/>
+        </w:trPr>
         <w:tc>
           <w:tcPr>
             <w:tcW w:type="dxa" w:w="2381"/>
@@ -11852,12 +12664,15 @@
                 <w:b w:val="0"/>
                 <w:sz w:val="19"/>
               </w:rPr>
-              <w:t>El servidor respondió 201 {mensaje: 'Tutoría programada', id: 7}: acepta la fecha «2027-13-45» y la hora «25:99» sin validar que existan.</w:t>
+              <w:t>El servidor respondió 201 {mensaje: 'Tutoría programada', id: 20}: acepta la fecha «2027-13-45» y la hora «25:99» sin validar que existan.</w:t>
             </w:r>
           </w:p>
         </w:tc>
       </w:tr>
       <w:tr>
+        <w:trPr>
+          <w:cantSplit w:val="true"/>
+        </w:trPr>
         <w:tc>
           <w:tcPr>
             <w:tcW w:type="dxa" w:w="2381"/>
@@ -11903,6 +12718,9 @@
         </w:tc>
       </w:tr>
       <w:tr>
+        <w:trPr>
+          <w:cantSplit w:val="true"/>
+        </w:trPr>
         <w:tc>
           <w:tcPr>
             <w:tcW w:type="dxa" w:w="2381"/>
@@ -11948,6 +12766,9 @@
         </w:tc>
       </w:tr>
       <w:tr>
+        <w:trPr>
+          <w:cantSplit w:val="true"/>
+        </w:trPr>
         <w:tc>
           <w:tcPr>
             <w:tcW w:type="dxa" w:w="2381"/>
@@ -11987,13 +12808,1634 @@
                 <w:b w:val="0"/>
                 <w:sz w:val="19"/>
               </w:rPr>
-              <w:t>EV-DEF10-CONSOLA.png</w:t>
+              <w:t>EV-DEF10-CONSOLA.png (figura 6, debajo)</w:t>
             </w:r>
           </w:p>
         </w:tc>
       </w:tr>
     </w:tbl>
+    <w:p>
+      <w:pPr>
+        <w:keepNext/>
+        <w:spacing w:before="80" w:after="40"/>
+        <w:jc w:val="center"/>
+      </w:pPr>
+      <w:r>
+        <w:drawing>
+          <wp:inline xmlns:a="http://schemas.openxmlformats.org/drawingml/2006/main" xmlns:pic="http://schemas.openxmlformats.org/drawingml/2006/picture">
+            <wp:extent cx="5580000" cy="3138750"/>
+            <wp:docPr id="6" name="Picture 6"/>
+            <wp:cNvGraphicFramePr>
+              <a:graphicFrameLocks noChangeAspect="1"/>
+            </wp:cNvGraphicFramePr>
+            <a:graphic>
+              <a:graphicData uri="http://schemas.openxmlformats.org/drawingml/2006/picture">
+                <pic:pic>
+                  <pic:nvPicPr>
+                    <pic:cNvPr id="0" name="EV-DEF10-CONSOLA.jpg"/>
+                    <pic:cNvPicPr/>
+                  </pic:nvPicPr>
+                  <pic:blipFill>
+                    <a:blip r:embed="rId15"/>
+                    <a:stretch>
+                      <a:fillRect/>
+                    </a:stretch>
+                  </pic:blipFill>
+                  <pic:spPr>
+                    <a:xfrm>
+                      <a:off x="0" y="0"/>
+                      <a:ext cx="5580000" cy="3138750"/>
+                    </a:xfrm>
+                    <a:prstGeom prst="rect"/>
+                  </pic:spPr>
+                </pic:pic>
+              </a:graphicData>
+            </a:graphic>
+          </wp:inline>
+        </w:drawing>
+      </w:r>
+    </w:p>
+    <w:p>
+      <w:pPr>
+        <w:spacing w:after="200"/>
+        <w:jc w:val="center"/>
+      </w:pPr>
+      <w:r>
+        <w:rPr>
+          <w:b/>
+          <w:i/>
+          <w:sz w:val="18"/>
+        </w:rPr>
+        <w:t xml:space="preserve">Figura 6. </w:t>
+      </w:r>
+      <w:r>
+        <w:rPr>
+          <w:i/>
+          <w:sz w:val="18"/>
+        </w:rPr>
+        <w:t>DEF-10 · EV-DEF10-CONSOLA.png. Consola F12 con el comando ejecutado y la respuesta: la api guarda tutorías con fechas y horas que no existen.</w:t>
+      </w:r>
+    </w:p>
     <w:p/>
+    <w:p>
+      <w:pPr>
+        <w:pStyle w:val="Heading3"/>
+      </w:pPr>
+      <w:r>
+        <w:t>DEF-13 · Los mensajes emergentes se generan pero nunca se ven</w:t>
+      </w:r>
+    </w:p>
+    <w:p>
+      <w:pPr>
+        <w:spacing w:after="60"/>
+      </w:pPr>
+      <w:r>
+        <w:rPr>
+          <w:b w:val="0"/>
+          <w:i w:val="0"/>
+          <w:sz w:val="21"/>
+        </w:rPr>
+        <w:t>Justo después de una acción que muestra un mensaje (cancelar una tutoría con menos de 24 horas), se inspecciona el elemento #tostada desde la consola, que es el paso 3 del reporte.</w:t>
+      </w:r>
+    </w:p>
+    <w:p>
+      <w:pPr>
+        <w:spacing w:after="40"/>
+      </w:pPr>
+      <w:r>
+        <w:rPr>
+          <w:b/>
+          <w:i w:val="0"/>
+          <w:sz w:val="19"/>
+        </w:rPr>
+        <w:t>Comando (pestaña Consola de F12):</w:t>
+      </w:r>
+    </w:p>
+    <w:tbl>
+      <w:tblPr>
+        <w:tblW w:type="auto" w:w="0"/>
+        <w:tblLook w:firstColumn="1" w:firstRow="1" w:lastColumn="0" w:lastRow="0" w:noHBand="0" w:noVBand="1" w:val="04A0"/>
+        <w:tblBorders>
+          <w:top w:val="single" w:sz="4" w:space="0" w:color="D1D5DB"/>
+          <w:left w:val="single" w:sz="4" w:space="0" w:color="D1D5DB"/>
+          <w:bottom w:val="single" w:sz="4" w:space="0" w:color="D1D5DB"/>
+          <w:right w:val="single" w:sz="4" w:space="0" w:color="D1D5DB"/>
+          <w:insideH w:val="single" w:sz="4" w:space="0" w:color="D1D5DB"/>
+          <w:insideV w:val="single" w:sz="4" w:space="0" w:color="D1D5DB"/>
+        </w:tblBorders>
+      </w:tblPr>
+      <w:tblGrid>
+        <w:gridCol w:w="9746"/>
+      </w:tblGrid>
+      <w:tr>
+        <w:trPr>
+          <w:cantSplit w:val="true"/>
+        </w:trPr>
+        <w:tc>
+          <w:tcPr>
+            <w:tcW w:type="dxa" w:w="9746"/>
+            <w:shd w:val="clear" w:color="auto" w:fill="1E1E1F"/>
+            <w:tcMar>
+              <w:top w:w="80" w:type="dxa"/>
+              <w:bottom w:w="80" w:type="dxa"/>
+              <w:start w:w="120" w:type="dxa"/>
+              <w:end w:w="120" w:type="dxa"/>
+            </w:tcMar>
+          </w:tcPr>
+          <w:p>
+            <w:pPr>
+              <w:spacing w:after="0" w:line="240" w:lineRule="auto"/>
+            </w:pPr>
+            <w:r/>
+            <w:r>
+              <w:rPr>
+                <w:rFonts w:ascii="Consolas" w:hAnsi="Consolas"/>
+                <w:color w:val="E8EAED"/>
+                <w:sz w:val="18"/>
+              </w:rPr>
+              <w:t>const t = document.getElementById("tostada");</w:t>
+            </w:r>
+          </w:p>
+          <w:p>
+            <w:pPr>
+              <w:spacing w:after="0" w:line="240" w:lineRule="auto"/>
+            </w:pPr>
+            <w:r>
+              <w:rPr>
+                <w:rFonts w:ascii="Consolas" w:hAnsi="Consolas"/>
+                <w:color w:val="E8EAED"/>
+                <w:sz w:val="18"/>
+              </w:rPr>
+              <w:t>console.log(t.textContent, "|", t.className,</w:t>
+            </w:r>
+          </w:p>
+          <w:p>
+            <w:pPr>
+              <w:spacing w:after="0" w:line="240" w:lineRule="auto"/>
+            </w:pPr>
+            <w:r>
+              <w:rPr>
+                <w:rFonts w:ascii="Consolas" w:hAnsi="Consolas"/>
+                <w:color w:val="E8EAED"/>
+                <w:sz w:val="18"/>
+              </w:rPr>
+              <w:t xml:space="preserve">  "| opacidad:", getComputedStyle(t).opacity)</w:t>
+            </w:r>
+          </w:p>
+        </w:tc>
+      </w:tr>
+    </w:tbl>
+    <w:tbl>
+      <w:tblPr>
+        <w:tblW w:type="auto" w:w="0"/>
+        <w:tblLook w:firstColumn="1" w:firstRow="1" w:lastColumn="0" w:lastRow="0" w:noHBand="0" w:noVBand="1" w:val="04A0"/>
+        <w:tblBorders>
+          <w:top w:val="single" w:sz="4" w:space="0" w:color="D1D5DB"/>
+          <w:left w:val="single" w:sz="4" w:space="0" w:color="D1D5DB"/>
+          <w:bottom w:val="single" w:sz="4" w:space="0" w:color="D1D5DB"/>
+          <w:right w:val="single" w:sz="4" w:space="0" w:color="D1D5DB"/>
+          <w:insideH w:val="single" w:sz="4" w:space="0" w:color="D1D5DB"/>
+          <w:insideV w:val="single" w:sz="4" w:space="0" w:color="D1D5DB"/>
+        </w:tblBorders>
+      </w:tblPr>
+      <w:tblGrid>
+        <w:gridCol w:w="4873"/>
+        <w:gridCol w:w="4873"/>
+      </w:tblGrid>
+      <w:tr>
+        <w:trPr>
+          <w:cantSplit w:val="true"/>
+        </w:trPr>
+        <w:tc>
+          <w:tcPr>
+            <w:tcW w:type="dxa" w:w="2381"/>
+            <w:shd w:val="clear" w:color="auto" w:fill="D7EDEA"/>
+            <w:tcMar>
+              <w:top w:w="40" w:type="dxa"/>
+              <w:bottom w:w="40" w:type="dxa"/>
+              <w:start w:w="80" w:type="dxa"/>
+              <w:end w:w="80" w:type="dxa"/>
+            </w:tcMar>
+          </w:tcPr>
+          <w:p>
+            <w:r/>
+            <w:r>
+              <w:rPr>
+                <w:b/>
+                <w:sz w:val="19"/>
+              </w:rPr>
+              <w:t>Requisito</w:t>
+            </w:r>
+          </w:p>
+        </w:tc>
+        <w:tc>
+          <w:tcPr>
+            <w:tcW w:type="dxa" w:w="7087"/>
+            <w:tcMar>
+              <w:top w:w="40" w:type="dxa"/>
+              <w:bottom w:w="40" w:type="dxa"/>
+              <w:start w:w="80" w:type="dxa"/>
+              <w:end w:w="80" w:type="dxa"/>
+            </w:tcMar>
+          </w:tcPr>
+          <w:p>
+            <w:r/>
+            <w:r>
+              <w:rPr>
+                <w:b w:val="0"/>
+                <w:sz w:val="19"/>
+              </w:rPr>
+              <w:t>RF028 · transversal</w:t>
+            </w:r>
+          </w:p>
+        </w:tc>
+      </w:tr>
+      <w:tr>
+        <w:trPr>
+          <w:cantSplit w:val="true"/>
+        </w:trPr>
+        <w:tc>
+          <w:tcPr>
+            <w:tcW w:type="dxa" w:w="2381"/>
+            <w:shd w:val="clear" w:color="auto" w:fill="D7EDEA"/>
+            <w:tcMar>
+              <w:top w:w="40" w:type="dxa"/>
+              <w:bottom w:w="40" w:type="dxa"/>
+              <w:start w:w="80" w:type="dxa"/>
+              <w:end w:w="80" w:type="dxa"/>
+            </w:tcMar>
+          </w:tcPr>
+          <w:p>
+            <w:r/>
+            <w:r>
+              <w:rPr>
+                <w:b/>
+                <w:sz w:val="19"/>
+              </w:rPr>
+              <w:t>Resultado esperado</w:t>
+            </w:r>
+          </w:p>
+        </w:tc>
+        <w:tc>
+          <w:tcPr>
+            <w:tcW w:type="dxa" w:w="7087"/>
+            <w:tcMar>
+              <w:top w:w="40" w:type="dxa"/>
+              <w:bottom w:w="40" w:type="dxa"/>
+              <w:start w:w="80" w:type="dxa"/>
+              <w:end w:w="80" w:type="dxa"/>
+            </w:tcMar>
+          </w:tcPr>
+          <w:p>
+            <w:r/>
+            <w:r>
+              <w:rPr>
+                <w:b w:val="0"/>
+                <w:sz w:val="19"/>
+              </w:rPr>
+              <w:t>RF028: el mensaje emergente se ve en pantalla (opacidad 1) y después desaparece solo.</w:t>
+            </w:r>
+          </w:p>
+        </w:tc>
+      </w:tr>
+      <w:tr>
+        <w:trPr>
+          <w:cantSplit w:val="true"/>
+        </w:trPr>
+        <w:tc>
+          <w:tcPr>
+            <w:tcW w:type="dxa" w:w="2381"/>
+            <w:shd w:val="clear" w:color="auto" w:fill="D7EDEA"/>
+            <w:tcMar>
+              <w:top w:w="40" w:type="dxa"/>
+              <w:bottom w:w="40" w:type="dxa"/>
+              <w:start w:w="80" w:type="dxa"/>
+              <w:end w:w="80" w:type="dxa"/>
+            </w:tcMar>
+          </w:tcPr>
+          <w:p>
+            <w:r/>
+            <w:r>
+              <w:rPr>
+                <w:b/>
+                <w:sz w:val="19"/>
+              </w:rPr>
+              <w:t>Resultado real</w:t>
+            </w:r>
+          </w:p>
+        </w:tc>
+        <w:tc>
+          <w:tcPr>
+            <w:tcW w:type="dxa" w:w="7087"/>
+            <w:tcMar>
+              <w:top w:w="40" w:type="dxa"/>
+              <w:bottom w:w="40" w:type="dxa"/>
+              <w:start w:w="80" w:type="dxa"/>
+              <w:end w:w="80" w:type="dxa"/>
+            </w:tcMar>
+          </w:tcPr>
+          <w:p>
+            <w:r/>
+            <w:r>
+              <w:rPr>
+                <w:b w:val="0"/>
+                <w:sz w:val="19"/>
+              </w:rPr>
+              <w:t>La consola imprime «Faltan 7h para la tutoría y se requieren 24h de anticipación para cancelar (RN03). Escríbele al docente. | tostada tostada--visible tostada--error | opacidad: 0». El elemento tiene el mensaje y la clase «tostada--visible», pero la hoja de estilos solo define «.tostada.visible»; por eso la opacidad se queda en 0 y en pantalla no aparece nada.</w:t>
+            </w:r>
+          </w:p>
+        </w:tc>
+      </w:tr>
+      <w:tr>
+        <w:trPr>
+          <w:cantSplit w:val="true"/>
+        </w:trPr>
+        <w:tc>
+          <w:tcPr>
+            <w:tcW w:type="dxa" w:w="2381"/>
+            <w:shd w:val="clear" w:color="auto" w:fill="D7EDEA"/>
+            <w:tcMar>
+              <w:top w:w="40" w:type="dxa"/>
+              <w:bottom w:w="40" w:type="dxa"/>
+              <w:start w:w="80" w:type="dxa"/>
+              <w:end w:w="80" w:type="dxa"/>
+            </w:tcMar>
+          </w:tcPr>
+          <w:p>
+            <w:r/>
+            <w:r>
+              <w:rPr>
+                <w:b/>
+                <w:sz w:val="19"/>
+              </w:rPr>
+              <w:t>Código HTTP</w:t>
+            </w:r>
+          </w:p>
+        </w:tc>
+        <w:tc>
+          <w:tcPr>
+            <w:tcW w:type="dxa" w:w="7087"/>
+            <w:tcMar>
+              <w:top w:w="40" w:type="dxa"/>
+              <w:bottom w:w="40" w:type="dxa"/>
+              <w:start w:w="80" w:type="dxa"/>
+              <w:end w:w="80" w:type="dxa"/>
+            </w:tcMar>
+          </w:tcPr>
+          <w:p>
+            <w:r/>
+            <w:r>
+              <w:rPr>
+                <w:b w:val="0"/>
+                <w:sz w:val="19"/>
+              </w:rPr>
+              <w:t>— (inspección del elemento, sin petición al servidor)</w:t>
+            </w:r>
+          </w:p>
+        </w:tc>
+      </w:tr>
+      <w:tr>
+        <w:trPr>
+          <w:cantSplit w:val="true"/>
+        </w:trPr>
+        <w:tc>
+          <w:tcPr>
+            <w:tcW w:type="dxa" w:w="2381"/>
+            <w:shd w:val="clear" w:color="auto" w:fill="D7EDEA"/>
+            <w:tcMar>
+              <w:top w:w="40" w:type="dxa"/>
+              <w:bottom w:w="40" w:type="dxa"/>
+              <w:start w:w="80" w:type="dxa"/>
+              <w:end w:w="80" w:type="dxa"/>
+            </w:tcMar>
+          </w:tcPr>
+          <w:p>
+            <w:r/>
+            <w:r>
+              <w:rPr>
+                <w:b/>
+                <w:sz w:val="19"/>
+              </w:rPr>
+              <w:t>Estado</w:t>
+            </w:r>
+          </w:p>
+        </w:tc>
+        <w:tc>
+          <w:tcPr>
+            <w:tcW w:type="dxa" w:w="7087"/>
+            <w:tcMar>
+              <w:top w:w="40" w:type="dxa"/>
+              <w:bottom w:w="40" w:type="dxa"/>
+              <w:start w:w="80" w:type="dxa"/>
+              <w:end w:w="80" w:type="dxa"/>
+            </w:tcMar>
+          </w:tcPr>
+          <w:p>
+            <w:r/>
+            <w:r>
+              <w:rPr>
+                <w:b w:val="0"/>
+                <w:sz w:val="19"/>
+              </w:rPr>
+              <w:t>Defecto confirmado</w:t>
+            </w:r>
+          </w:p>
+        </w:tc>
+      </w:tr>
+      <w:tr>
+        <w:trPr>
+          <w:cantSplit w:val="true"/>
+        </w:trPr>
+        <w:tc>
+          <w:tcPr>
+            <w:tcW w:type="dxa" w:w="2381"/>
+            <w:shd w:val="clear" w:color="auto" w:fill="D7EDEA"/>
+            <w:tcMar>
+              <w:top w:w="40" w:type="dxa"/>
+              <w:bottom w:w="40" w:type="dxa"/>
+              <w:start w:w="80" w:type="dxa"/>
+              <w:end w:w="80" w:type="dxa"/>
+            </w:tcMar>
+          </w:tcPr>
+          <w:p>
+            <w:r/>
+            <w:r>
+              <w:rPr>
+                <w:b/>
+                <w:sz w:val="19"/>
+              </w:rPr>
+              <w:t>Evidencia</w:t>
+            </w:r>
+          </w:p>
+        </w:tc>
+        <w:tc>
+          <w:tcPr>
+            <w:tcW w:type="dxa" w:w="7087"/>
+            <w:tcMar>
+              <w:top w:w="40" w:type="dxa"/>
+              <w:bottom w:w="40" w:type="dxa"/>
+              <w:start w:w="80" w:type="dxa"/>
+              <w:end w:w="80" w:type="dxa"/>
+            </w:tcMar>
+          </w:tcPr>
+          <w:p>
+            <w:r/>
+            <w:r>
+              <w:rPr>
+                <w:b w:val="0"/>
+                <w:sz w:val="19"/>
+              </w:rPr>
+              <w:t>EV-DEF13-CONSOLA.png (figura 7, debajo)</w:t>
+            </w:r>
+          </w:p>
+        </w:tc>
+      </w:tr>
+    </w:tbl>
+    <w:p>
+      <w:pPr>
+        <w:keepNext/>
+        <w:spacing w:before="80" w:after="40"/>
+        <w:jc w:val="center"/>
+      </w:pPr>
+      <w:r>
+        <w:drawing>
+          <wp:inline xmlns:a="http://schemas.openxmlformats.org/drawingml/2006/main" xmlns:pic="http://schemas.openxmlformats.org/drawingml/2006/picture">
+            <wp:extent cx="5580000" cy="3138750"/>
+            <wp:docPr id="7" name="Picture 7"/>
+            <wp:cNvGraphicFramePr>
+              <a:graphicFrameLocks noChangeAspect="1"/>
+            </wp:cNvGraphicFramePr>
+            <a:graphic>
+              <a:graphicData uri="http://schemas.openxmlformats.org/drawingml/2006/picture">
+                <pic:pic>
+                  <pic:nvPicPr>
+                    <pic:cNvPr id="0" name="EV-DEF13-CONSOLA.jpg"/>
+                    <pic:cNvPicPr/>
+                  </pic:nvPicPr>
+                  <pic:blipFill>
+                    <a:blip r:embed="rId16"/>
+                    <a:stretch>
+                      <a:fillRect/>
+                    </a:stretch>
+                  </pic:blipFill>
+                  <pic:spPr>
+                    <a:xfrm>
+                      <a:off x="0" y="0"/>
+                      <a:ext cx="5580000" cy="3138750"/>
+                    </a:xfrm>
+                    <a:prstGeom prst="rect"/>
+                  </pic:spPr>
+                </pic:pic>
+              </a:graphicData>
+            </a:graphic>
+          </wp:inline>
+        </w:drawing>
+      </w:r>
+    </w:p>
+    <w:p>
+      <w:pPr>
+        <w:spacing w:after="200"/>
+        <w:jc w:val="center"/>
+      </w:pPr>
+      <w:r>
+        <w:rPr>
+          <w:b/>
+          <w:i/>
+          <w:sz w:val="18"/>
+        </w:rPr>
+        <w:t xml:space="preserve">Figura 7. </w:t>
+      </w:r>
+      <w:r>
+        <w:rPr>
+          <w:i/>
+          <w:sz w:val="18"/>
+        </w:rPr>
+        <w:t>DEF-13 · EV-DEF13-CONSOLA.png. Consola F12 con el comando ejecutado y la respuesta: los mensajes emergentes se generan pero nunca se ven.</w:t>
+      </w:r>
+    </w:p>
+    <w:p/>
+    <w:p>
+      <w:r>
+        <w:br w:type="page"/>
+      </w:r>
+    </w:p>
+    <w:p>
+      <w:pPr>
+        <w:pStyle w:val="Heading1"/>
+      </w:pPr>
+      <w:r>
+        <w:t>Anexo G. Evidencia de los ocho defectos</w:t>
+      </w:r>
+    </w:p>
+    <w:p>
+      <w:pPr>
+        <w:spacing w:after="120"/>
+      </w:pPr>
+      <w:r>
+        <w:rPr>
+          <w:b w:val="0"/>
+          <w:i w:val="0"/>
+          <w:sz w:val="21"/>
+        </w:rPr>
+        <w:t>Las capturas que cita el campo «Evidencia» de cada reporte, en el mismo orden de la sección 4. Cada una lleva estampado el caso o defecto, el ciclo, la URL, la hora de Colombia y el navegador. Las capturas de consola de DEF-06 y DEF-13 están en el Anexo F.</w:t>
+      </w:r>
+    </w:p>
+    <w:p>
+      <w:pPr>
+        <w:pStyle w:val="Heading3"/>
+      </w:pPr>
+      <w:r>
+        <w:t>DEF-01 · La sesión sigue abierta después de 16 minutos sin actividad; solo se cierra a las 2 horas, y únicamente al recargar</w:t>
+      </w:r>
+    </w:p>
+    <w:p>
+      <w:pPr>
+        <w:keepNext/>
+        <w:spacing w:before="80" w:after="40"/>
+        <w:jc w:val="center"/>
+      </w:pPr>
+      <w:r>
+        <w:drawing>
+          <wp:inline xmlns:a="http://schemas.openxmlformats.org/drawingml/2006/main" xmlns:pic="http://schemas.openxmlformats.org/drawingml/2006/picture">
+            <wp:extent cx="5580000" cy="3138750"/>
+            <wp:docPr id="8" name="Picture 8"/>
+            <wp:cNvGraphicFramePr>
+              <a:graphicFrameLocks noChangeAspect="1"/>
+            </wp:cNvGraphicFramePr>
+            <a:graphic>
+              <a:graphicData uri="http://schemas.openxmlformats.org/drawingml/2006/picture">
+                <pic:pic>
+                  <pic:nvPicPr>
+                    <pic:cNvPr id="0" name="EV-CP034-C1-01.jpg"/>
+                    <pic:cNvPicPr/>
+                  </pic:nvPicPr>
+                  <pic:blipFill>
+                    <a:blip r:embed="rId17"/>
+                    <a:stretch>
+                      <a:fillRect/>
+                    </a:stretch>
+                  </pic:blipFill>
+                  <pic:spPr>
+                    <a:xfrm>
+                      <a:off x="0" y="0"/>
+                      <a:ext cx="5580000" cy="3138750"/>
+                    </a:xfrm>
+                    <a:prstGeom prst="rect"/>
+                  </pic:spPr>
+                </pic:pic>
+              </a:graphicData>
+            </a:graphic>
+          </wp:inline>
+        </w:drawing>
+      </w:r>
+    </w:p>
+    <w:p>
+      <w:pPr>
+        <w:spacing w:after="200"/>
+        <w:jc w:val="center"/>
+      </w:pPr>
+      <w:r>
+        <w:rPr>
+          <w:b/>
+          <w:i/>
+          <w:sz w:val="18"/>
+        </w:rPr>
+        <w:t xml:space="preserve">Figura 8. </w:t>
+      </w:r>
+      <w:r>
+        <w:rPr>
+          <w:i/>
+          <w:sz w:val="18"/>
+        </w:rPr>
+        <w:t>DEF-01 · EV-CP034-C1-01.png. Inicio: sesión de sgarcia abierta</w:t>
+      </w:r>
+    </w:p>
+    <w:p>
+      <w:pPr>
+        <w:keepNext/>
+        <w:spacing w:before="80" w:after="40"/>
+        <w:jc w:val="center"/>
+      </w:pPr>
+      <w:r>
+        <w:drawing>
+          <wp:inline xmlns:a="http://schemas.openxmlformats.org/drawingml/2006/main" xmlns:pic="http://schemas.openxmlformats.org/drawingml/2006/picture">
+            <wp:extent cx="5580000" cy="3138750"/>
+            <wp:docPr id="9" name="Picture 9"/>
+            <wp:cNvGraphicFramePr>
+              <a:graphicFrameLocks noChangeAspect="1"/>
+            </wp:cNvGraphicFramePr>
+            <a:graphic>
+              <a:graphicData uri="http://schemas.openxmlformats.org/drawingml/2006/picture">
+                <pic:pic>
+                  <pic:nvPicPr>
+                    <pic:cNvPr id="0" name="EV-CP034-C1-02.jpg"/>
+                    <pic:cNvPicPr/>
+                  </pic:nvPicPr>
+                  <pic:blipFill>
+                    <a:blip r:embed="rId18"/>
+                    <a:stretch>
+                      <a:fillRect/>
+                    </a:stretch>
+                  </pic:blipFill>
+                  <pic:spPr>
+                    <a:xfrm>
+                      <a:off x="0" y="0"/>
+                      <a:ext cx="5580000" cy="3138750"/>
+                    </a:xfrm>
+                    <a:prstGeom prst="rect"/>
+                  </pic:spPr>
+                </pic:pic>
+              </a:graphicData>
+            </a:graphic>
+          </wp:inline>
+        </w:drawing>
+      </w:r>
+    </w:p>
+    <w:p>
+      <w:pPr>
+        <w:spacing w:after="200"/>
+        <w:jc w:val="center"/>
+      </w:pPr>
+      <w:r>
+        <w:rPr>
+          <w:b/>
+          <w:i/>
+          <w:sz w:val="18"/>
+        </w:rPr>
+        <w:t xml:space="preserve">Figura 9. </w:t>
+      </w:r>
+      <w:r>
+        <w:rPr>
+          <w:i/>
+          <w:sz w:val="18"/>
+        </w:rPr>
+        <w:t>DEF-01 · EV-CP034-C1-02.png. 16 min sin actividad: sigue en el panel; token presente</w:t>
+      </w:r>
+    </w:p>
+    <w:p>
+      <w:pPr>
+        <w:keepNext/>
+        <w:spacing w:before="80" w:after="40"/>
+        <w:jc w:val="center"/>
+      </w:pPr>
+      <w:r>
+        <w:drawing>
+          <wp:inline xmlns:a="http://schemas.openxmlformats.org/drawingml/2006/main" xmlns:pic="http://schemas.openxmlformats.org/drawingml/2006/picture">
+            <wp:extent cx="5580000" cy="3138750"/>
+            <wp:docPr id="10" name="Picture 10"/>
+            <wp:cNvGraphicFramePr>
+              <a:graphicFrameLocks noChangeAspect="1"/>
+            </wp:cNvGraphicFramePr>
+            <a:graphic>
+              <a:graphicData uri="http://schemas.openxmlformats.org/drawingml/2006/picture">
+                <pic:pic>
+                  <pic:nvPicPr>
+                    <pic:cNvPr id="0" name="EV-CP034-C1-03.jpg"/>
+                    <pic:cNvPicPr/>
+                  </pic:nvPicPr>
+                  <pic:blipFill>
+                    <a:blip r:embed="rId19"/>
+                    <a:stretch>
+                      <a:fillRect/>
+                    </a:stretch>
+                  </pic:blipFill>
+                  <pic:spPr>
+                    <a:xfrm>
+                      <a:off x="0" y="0"/>
+                      <a:ext cx="5580000" cy="3138750"/>
+                    </a:xfrm>
+                    <a:prstGeom prst="rect"/>
+                  </pic:spPr>
+                </pic:pic>
+              </a:graphicData>
+            </a:graphic>
+          </wp:inline>
+        </w:drawing>
+      </w:r>
+    </w:p>
+    <w:p>
+      <w:pPr>
+        <w:spacing w:after="200"/>
+        <w:jc w:val="center"/>
+      </w:pPr>
+      <w:r>
+        <w:rPr>
+          <w:b/>
+          <w:i/>
+          <w:sz w:val="18"/>
+        </w:rPr>
+        <w:t xml:space="preserve">Figura 10. </w:t>
+      </w:r>
+      <w:r>
+        <w:rPr>
+          <w:i/>
+          <w:sz w:val="18"/>
+        </w:rPr>
+        <w:t>DEF-01 · EV-CP034-C1-03.png. Después de «Programar Tutoría» y recargar: panel con la sesión activa</w:t>
+      </w:r>
+    </w:p>
+    <w:p>
+      <w:pPr>
+        <w:pStyle w:val="Heading3"/>
+      </w:pPr>
+      <w:r>
+        <w:t>DEF-02 · El administrador programa una asesoría con fecha de hoy, y por la API también con fechas pasadas</w:t>
+      </w:r>
+    </w:p>
+    <w:p>
+      <w:pPr>
+        <w:keepNext/>
+        <w:spacing w:before="80" w:after="40"/>
+        <w:jc w:val="center"/>
+      </w:pPr>
+      <w:r>
+        <w:drawing>
+          <wp:inline xmlns:a="http://schemas.openxmlformats.org/drawingml/2006/main" xmlns:pic="http://schemas.openxmlformats.org/drawingml/2006/picture">
+            <wp:extent cx="5580000" cy="3138750"/>
+            <wp:docPr id="11" name="Picture 11"/>
+            <wp:cNvGraphicFramePr>
+              <a:graphicFrameLocks noChangeAspect="1"/>
+            </wp:cNvGraphicFramePr>
+            <a:graphic>
+              <a:graphicData uri="http://schemas.openxmlformats.org/drawingml/2006/picture">
+                <pic:pic>
+                  <pic:nvPicPr>
+                    <pic:cNvPr id="0" name="EV-CP032-C1-01.jpg"/>
+                    <pic:cNvPicPr/>
+                  </pic:nvPicPr>
+                  <pic:blipFill>
+                    <a:blip r:embed="rId20"/>
+                    <a:stretch>
+                      <a:fillRect/>
+                    </a:stretch>
+                  </pic:blipFill>
+                  <pic:spPr>
+                    <a:xfrm>
+                      <a:off x="0" y="0"/>
+                      <a:ext cx="5580000" cy="3138750"/>
+                    </a:xfrm>
+                    <a:prstGeom prst="rect"/>
+                  </pic:spPr>
+                </pic:pic>
+              </a:graphicData>
+            </a:graphic>
+          </wp:inline>
+        </w:drawing>
+      </w:r>
+    </w:p>
+    <w:p>
+      <w:pPr>
+        <w:spacing w:after="200"/>
+        <w:jc w:val="center"/>
+      </w:pPr>
+      <w:r>
+        <w:rPr>
+          <w:b/>
+          <w:i/>
+          <w:sz w:val="18"/>
+        </w:rPr>
+        <w:t xml:space="preserve">Figura 11. </w:t>
+      </w:r>
+      <w:r>
+        <w:rPr>
+          <w:i/>
+          <w:sz w:val="18"/>
+        </w:rPr>
+        <w:t>DEF-02 · EV-CP032-C1-01.png. Asesoría Sandra Ríos + Camilo Ríos, 07/10/2026 19:10 → 200</w:t>
+      </w:r>
+    </w:p>
+    <w:p>
+      <w:pPr>
+        <w:pStyle w:val="Heading3"/>
+      </w:pPr>
+      <w:r>
+        <w:t>DEF-06 · Una tutoría cancelada pasa a «completada» si el docente la marca como realizada por la API</w:t>
+      </w:r>
+    </w:p>
+    <w:p>
+      <w:pPr>
+        <w:keepNext/>
+        <w:spacing w:before="80" w:after="40"/>
+        <w:jc w:val="center"/>
+      </w:pPr>
+      <w:r>
+        <w:drawing>
+          <wp:inline xmlns:a="http://schemas.openxmlformats.org/drawingml/2006/main" xmlns:pic="http://schemas.openxmlformats.org/drawingml/2006/picture">
+            <wp:extent cx="5580000" cy="3138750"/>
+            <wp:docPr id="12" name="Picture 12"/>
+            <wp:cNvGraphicFramePr>
+              <a:graphicFrameLocks noChangeAspect="1"/>
+            </wp:cNvGraphicFramePr>
+            <a:graphic>
+              <a:graphicData uri="http://schemas.openxmlformats.org/drawingml/2006/picture">
+                <pic:pic>
+                  <pic:nvPicPr>
+                    <pic:cNvPr id="0" name="EV-DEF06-C1-01.jpg"/>
+                    <pic:cNvPicPr/>
+                  </pic:nvPicPr>
+                  <pic:blipFill>
+                    <a:blip r:embed="rId21"/>
+                    <a:stretch>
+                      <a:fillRect/>
+                    </a:stretch>
+                  </pic:blipFill>
+                  <pic:spPr>
+                    <a:xfrm>
+                      <a:off x="0" y="0"/>
+                      <a:ext cx="5580000" cy="3138750"/>
+                    </a:xfrm>
+                    <a:prstGeom prst="rect"/>
+                  </pic:spPr>
+                </pic:pic>
+              </a:graphicData>
+            </a:graphic>
+          </wp:inline>
+        </w:drawing>
+      </w:r>
+    </w:p>
+    <w:p>
+      <w:pPr>
+        <w:spacing w:after="200"/>
+        <w:jc w:val="center"/>
+      </w:pPr>
+      <w:r>
+        <w:rPr>
+          <w:b/>
+          <w:i/>
+          <w:sz w:val="18"/>
+        </w:rPr>
+        <w:t xml:space="preserve">Figura 12. </w:t>
+      </w:r>
+      <w:r>
+        <w:rPr>
+          <w:i/>
+          <w:sz w:val="18"/>
+        </w:rPr>
+        <w:t>DEF-06 · EV-DEF06-C1-01.png. Antes: la tutoría #16 aparece «Cancelada» en el panel de la docente</w:t>
+      </w:r>
+    </w:p>
+    <w:p>
+      <w:pPr>
+        <w:keepNext/>
+        <w:spacing w:before="80" w:after="40"/>
+        <w:jc w:val="center"/>
+      </w:pPr>
+      <w:r>
+        <w:drawing>
+          <wp:inline xmlns:a="http://schemas.openxmlformats.org/drawingml/2006/main" xmlns:pic="http://schemas.openxmlformats.org/drawingml/2006/picture">
+            <wp:extent cx="5580000" cy="3138750"/>
+            <wp:docPr id="13" name="Picture 13"/>
+            <wp:cNvGraphicFramePr>
+              <a:graphicFrameLocks noChangeAspect="1"/>
+            </wp:cNvGraphicFramePr>
+            <a:graphic>
+              <a:graphicData uri="http://schemas.openxmlformats.org/drawingml/2006/picture">
+                <pic:pic>
+                  <pic:nvPicPr>
+                    <pic:cNvPr id="0" name="EV-DEF06-C1-02.jpg"/>
+                    <pic:cNvPicPr/>
+                  </pic:nvPicPr>
+                  <pic:blipFill>
+                    <a:blip r:embed="rId22"/>
+                    <a:stretch>
+                      <a:fillRect/>
+                    </a:stretch>
+                  </pic:blipFill>
+                  <pic:spPr>
+                    <a:xfrm>
+                      <a:off x="0" y="0"/>
+                      <a:ext cx="5580000" cy="3138750"/>
+                    </a:xfrm>
+                    <a:prstGeom prst="rect"/>
+                  </pic:spPr>
+                </pic:pic>
+              </a:graphicData>
+            </a:graphic>
+          </wp:inline>
+        </w:drawing>
+      </w:r>
+    </w:p>
+    <w:p>
+      <w:pPr>
+        <w:spacing w:after="200"/>
+        <w:jc w:val="center"/>
+      </w:pPr>
+      <w:r>
+        <w:rPr>
+          <w:b/>
+          <w:i/>
+          <w:sz w:val="18"/>
+        </w:rPr>
+        <w:t xml:space="preserve">Figura 13. </w:t>
+      </w:r>
+      <w:r>
+        <w:rPr>
+          <w:i/>
+          <w:sz w:val="18"/>
+        </w:rPr>
+        <w:t>DEF-06 · EV-DEF06-C1-02.png. Consola F12: Sesión de mgonzalez@amigo.edu.co (docente). La tutoría #16 estaba cancelada</w:t>
+      </w:r>
+    </w:p>
+    <w:p>
+      <w:pPr>
+        <w:keepNext/>
+        <w:spacing w:before="80" w:after="40"/>
+        <w:jc w:val="center"/>
+      </w:pPr>
+      <w:r>
+        <w:drawing>
+          <wp:inline xmlns:a="http://schemas.openxmlformats.org/drawingml/2006/main" xmlns:pic="http://schemas.openxmlformats.org/drawingml/2006/picture">
+            <wp:extent cx="5580000" cy="3138750"/>
+            <wp:docPr id="14" name="Picture 14"/>
+            <wp:cNvGraphicFramePr>
+              <a:graphicFrameLocks noChangeAspect="1"/>
+            </wp:cNvGraphicFramePr>
+            <a:graphic>
+              <a:graphicData uri="http://schemas.openxmlformats.org/drawingml/2006/picture">
+                <pic:pic>
+                  <pic:nvPicPr>
+                    <pic:cNvPr id="0" name="EV-DEF06-C1-03.jpg"/>
+                    <pic:cNvPicPr/>
+                  </pic:nvPicPr>
+                  <pic:blipFill>
+                    <a:blip r:embed="rId23"/>
+                    <a:stretch>
+                      <a:fillRect/>
+                    </a:stretch>
+                  </pic:blipFill>
+                  <pic:spPr>
+                    <a:xfrm>
+                      <a:off x="0" y="0"/>
+                      <a:ext cx="5580000" cy="3138750"/>
+                    </a:xfrm>
+                    <a:prstGeom prst="rect"/>
+                  </pic:spPr>
+                </pic:pic>
+              </a:graphicData>
+            </a:graphic>
+          </wp:inline>
+        </w:drawing>
+      </w:r>
+    </w:p>
+    <w:p>
+      <w:pPr>
+        <w:spacing w:after="200"/>
+        <w:jc w:val="center"/>
+      </w:pPr>
+      <w:r>
+        <w:rPr>
+          <w:b/>
+          <w:i/>
+          <w:sz w:val="18"/>
+        </w:rPr>
+        <w:t xml:space="preserve">Figura 14. </w:t>
+      </w:r>
+      <w:r>
+        <w:rPr>
+          <w:i/>
+          <w:sz w:val="18"/>
+        </w:rPr>
+        <w:t>DEF-06 · EV-DEF06-C1-03.png. Después de PATCH /realizada (200 {"mensaje":"Tutoría completada"}): la misma tutoría #16 queda «completada»</w:t>
+      </w:r>
+    </w:p>
+    <w:p>
+      <w:pPr>
+        <w:pStyle w:val="Heading3"/>
+      </w:pPr>
+      <w:r>
+        <w:t>DEF-07 · Las contraseñas se ven en claro en «Nuevo usuario» y «Editar usuario», y la primera trae «Cambiar123» escrita</w:t>
+      </w:r>
+    </w:p>
+    <w:p>
+      <w:pPr>
+        <w:keepNext/>
+        <w:spacing w:before="80" w:after="40"/>
+        <w:jc w:val="center"/>
+      </w:pPr>
+      <w:r>
+        <w:drawing>
+          <wp:inline xmlns:a="http://schemas.openxmlformats.org/drawingml/2006/main" xmlns:pic="http://schemas.openxmlformats.org/drawingml/2006/picture">
+            <wp:extent cx="5580000" cy="3138750"/>
+            <wp:docPr id="15" name="Picture 15"/>
+            <wp:cNvGraphicFramePr>
+              <a:graphicFrameLocks noChangeAspect="1"/>
+            </wp:cNvGraphicFramePr>
+            <a:graphic>
+              <a:graphicData uri="http://schemas.openxmlformats.org/drawingml/2006/picture">
+                <pic:pic>
+                  <pic:nvPicPr>
+                    <pic:cNvPr id="0" name="EV-DEF07-C1-01.jpg"/>
+                    <pic:cNvPicPr/>
+                  </pic:nvPicPr>
+                  <pic:blipFill>
+                    <a:blip r:embed="rId24"/>
+                    <a:stretch>
+                      <a:fillRect/>
+                    </a:stretch>
+                  </pic:blipFill>
+                  <pic:spPr>
+                    <a:xfrm>
+                      <a:off x="0" y="0"/>
+                      <a:ext cx="5580000" cy="3138750"/>
+                    </a:xfrm>
+                    <a:prstGeom prst="rect"/>
+                  </pic:spPr>
+                </pic:pic>
+              </a:graphicData>
+            </a:graphic>
+          </wp:inline>
+        </w:drawing>
+      </w:r>
+    </w:p>
+    <w:p>
+      <w:pPr>
+        <w:spacing w:after="200"/>
+        <w:jc w:val="center"/>
+      </w:pPr>
+      <w:r>
+        <w:rPr>
+          <w:b/>
+          <w:i/>
+          <w:sz w:val="18"/>
+        </w:rPr>
+        <w:t xml:space="preserve">Figura 15. </w:t>
+      </w:r>
+      <w:r>
+        <w:rPr>
+          <w:i/>
+          <w:sz w:val="18"/>
+        </w:rPr>
+        <w:t>DEF-07 · EV-DEF07-C1-01.png. «Nuevo Usuario»: campo contraseña type="text" con el valor «Cambiar123». «Editar»: type="text" muestra «Prueba1234»</w:t>
+      </w:r>
+    </w:p>
+    <w:p>
+      <w:pPr>
+        <w:pStyle w:val="Heading3"/>
+      </w:pPr>
+      <w:r>
+        <w:t>DEF-08 · La regla de 24 horas para cancelar se calcula con 5 horas de diferencia: con 26 h de margen dice que faltan 21</w:t>
+      </w:r>
+    </w:p>
+    <w:p>
+      <w:pPr>
+        <w:keepNext/>
+        <w:spacing w:before="80" w:after="40"/>
+        <w:jc w:val="center"/>
+      </w:pPr>
+      <w:r>
+        <w:drawing>
+          <wp:inline xmlns:a="http://schemas.openxmlformats.org/drawingml/2006/main" xmlns:pic="http://schemas.openxmlformats.org/drawingml/2006/picture">
+            <wp:extent cx="5580000" cy="3138750"/>
+            <wp:docPr id="16" name="Picture 16"/>
+            <wp:cNvGraphicFramePr>
+              <a:graphicFrameLocks noChangeAspect="1"/>
+            </wp:cNvGraphicFramePr>
+            <a:graphic>
+              <a:graphicData uri="http://schemas.openxmlformats.org/drawingml/2006/picture">
+                <pic:pic>
+                  <pic:nvPicPr>
+                    <pic:cNvPr id="0" name="EV-CP025-C1-01.jpg"/>
+                    <pic:cNvPicPr/>
+                  </pic:nvPicPr>
+                  <pic:blipFill>
+                    <a:blip r:embed="rId25"/>
+                    <a:stretch>
+                      <a:fillRect/>
+                    </a:stretch>
+                  </pic:blipFill>
+                  <pic:spPr>
+                    <a:xfrm>
+                      <a:off x="0" y="0"/>
+                      <a:ext cx="5580000" cy="3138750"/>
+                    </a:xfrm>
+                    <a:prstGeom prst="rect"/>
+                  </pic:spPr>
+                </pic:pic>
+              </a:graphicData>
+            </a:graphic>
+          </wp:inline>
+        </w:drawing>
+      </w:r>
+    </w:p>
+    <w:p>
+      <w:pPr>
+        <w:spacing w:after="200"/>
+        <w:jc w:val="center"/>
+      </w:pPr>
+      <w:r>
+        <w:rPr>
+          <w:b/>
+          <w:i/>
+          <w:sz w:val="18"/>
+        </w:rPr>
+        <w:t xml:space="preserve">Figura 16. </w:t>
+      </w:r>
+      <w:r>
+        <w:rPr>
+          <w:i/>
+          <w:sz w:val="18"/>
+        </w:rPr>
+        <w:t>DEF-08 · EV-CP025-C1-01.png. Tutoría 08/10/2026 19:12 con Laura Vargas Suárez (margen real 26.0 h) → PATCH 400 · «Pendiente». El elemento #tostada tiene el texto «Faltan 21h para la tutoría y se requieren 24h de anticipación para cancelar (RN03). Escríbele al docente.» y las clases «tostada tostada--visible tostada--error», con opacidad calculada 0</w:t>
+      </w:r>
+    </w:p>
+    <w:p>
+      <w:pPr>
+        <w:pStyle w:val="Heading3"/>
+      </w:pPr>
+      <w:r>
+        <w:t>DEF-11 · El filtro «Activos» muestra cuentas inactivas y oculta a los estudiantes activos que están en alerta</w:t>
+      </w:r>
+    </w:p>
+    <w:p>
+      <w:pPr>
+        <w:keepNext/>
+        <w:spacing w:before="80" w:after="40"/>
+        <w:jc w:val="center"/>
+      </w:pPr>
+      <w:r>
+        <w:drawing>
+          <wp:inline xmlns:a="http://schemas.openxmlformats.org/drawingml/2006/main" xmlns:pic="http://schemas.openxmlformats.org/drawingml/2006/picture">
+            <wp:extent cx="5580000" cy="3138750"/>
+            <wp:docPr id="17" name="Picture 17"/>
+            <wp:cNvGraphicFramePr>
+              <a:graphicFrameLocks noChangeAspect="1"/>
+            </wp:cNvGraphicFramePr>
+            <a:graphic>
+              <a:graphicData uri="http://schemas.openxmlformats.org/drawingml/2006/picture">
+                <pic:pic>
+                  <pic:nvPicPr>
+                    <pic:cNvPr id="0" name="EV-CP031-C1-01.jpg"/>
+                    <pic:cNvPicPr/>
+                  </pic:nvPicPr>
+                  <pic:blipFill>
+                    <a:blip r:embed="rId26"/>
+                    <a:stretch>
+                      <a:fillRect/>
+                    </a:stretch>
+                  </pic:blipFill>
+                  <pic:spPr>
+                    <a:xfrm>
+                      <a:off x="0" y="0"/>
+                      <a:ext cx="5580000" cy="3138750"/>
+                    </a:xfrm>
+                    <a:prstGeom prst="rect"/>
+                  </pic:spPr>
+                </pic:pic>
+              </a:graphicData>
+            </a:graphic>
+          </wp:inline>
+        </w:drawing>
+      </w:r>
+    </w:p>
+    <w:p>
+      <w:pPr>
+        <w:spacing w:after="200"/>
+        <w:jc w:val="center"/>
+      </w:pPr>
+      <w:r>
+        <w:rPr>
+          <w:b/>
+          <w:i/>
+          <w:sz w:val="18"/>
+        </w:rPr>
+        <w:t xml:space="preserve">Figura 17. </w:t>
+      </w:r>
+      <w:r>
+        <w:rPr>
+          <w:i/>
+          <w:sz w:val="18"/>
+        </w:rPr>
+        <w:t>DEF-11 · EV-CP031-C1-01.png. Estudiantes + Activos + «»: 11 visibles, 15 esperados. Sobran: vosorio@amigo.edu.co. Faltan: perfil.c1@amigo.edu.co, lcano@amigo.edu.co, dmontoya@amigo.edu.co, malvarez@amigo.edu.co, lramirez@amigo.edu.co</w:t>
+      </w:r>
+    </w:p>
+    <w:p>
+      <w:pPr>
+        <w:keepNext/>
+        <w:spacing w:before="80" w:after="40"/>
+        <w:jc w:val="center"/>
+      </w:pPr>
+      <w:r>
+        <w:drawing>
+          <wp:inline xmlns:a="http://schemas.openxmlformats.org/drawingml/2006/main" xmlns:pic="http://schemas.openxmlformats.org/drawingml/2006/picture">
+            <wp:extent cx="5580000" cy="3138750"/>
+            <wp:docPr id="18" name="Picture 18"/>
+            <wp:cNvGraphicFramePr>
+              <a:graphicFrameLocks noChangeAspect="1"/>
+            </wp:cNvGraphicFramePr>
+            <a:graphic>
+              <a:graphicData uri="http://schemas.openxmlformats.org/drawingml/2006/picture">
+                <pic:pic>
+                  <pic:nvPicPr>
+                    <pic:cNvPr id="0" name="EV-CP031-C1-02.jpg"/>
+                    <pic:cNvPicPr/>
+                  </pic:nvPicPr>
+                  <pic:blipFill>
+                    <a:blip r:embed="rId27"/>
+                    <a:stretch>
+                      <a:fillRect/>
+                    </a:stretch>
+                  </pic:blipFill>
+                  <pic:spPr>
+                    <a:xfrm>
+                      <a:off x="0" y="0"/>
+                      <a:ext cx="5580000" cy="3138750"/>
+                    </a:xfrm>
+                    <a:prstGeom prst="rect"/>
+                  </pic:spPr>
+                </pic:pic>
+              </a:graphicData>
+            </a:graphic>
+          </wp:inline>
+        </w:drawing>
+      </w:r>
+    </w:p>
+    <w:p>
+      <w:pPr>
+        <w:spacing w:after="200"/>
+        <w:jc w:val="center"/>
+      </w:pPr>
+      <w:r>
+        <w:rPr>
+          <w:b/>
+          <w:i/>
+          <w:sz w:val="18"/>
+        </w:rPr>
+        <w:t xml:space="preserve">Figura 18. </w:t>
+      </w:r>
+      <w:r>
+        <w:rPr>
+          <w:i/>
+          <w:sz w:val="18"/>
+        </w:rPr>
+        <w:t>DEF-11 · EV-CP031-C1-02.png. Docentes + Inactivos + «Peña»: 0 visibles, 0 esperados</w:t>
+      </w:r>
+    </w:p>
+    <w:p>
+      <w:pPr>
+        <w:keepNext/>
+        <w:spacing w:before="80" w:after="40"/>
+        <w:jc w:val="center"/>
+      </w:pPr>
+      <w:r>
+        <w:drawing>
+          <wp:inline xmlns:a="http://schemas.openxmlformats.org/drawingml/2006/main" xmlns:pic="http://schemas.openxmlformats.org/drawingml/2006/picture">
+            <wp:extent cx="5580000" cy="3138750"/>
+            <wp:docPr id="19" name="Picture 19"/>
+            <wp:cNvGraphicFramePr>
+              <a:graphicFrameLocks noChangeAspect="1"/>
+            </wp:cNvGraphicFramePr>
+            <a:graphic>
+              <a:graphicData uri="http://schemas.openxmlformats.org/drawingml/2006/picture">
+                <pic:pic>
+                  <pic:nvPicPr>
+                    <pic:cNvPr id="0" name="EV-CP031-C1-03.jpg"/>
+                    <pic:cNvPicPr/>
+                  </pic:nvPicPr>
+                  <pic:blipFill>
+                    <a:blip r:embed="rId28"/>
+                    <a:stretch>
+                      <a:fillRect/>
+                    </a:stretch>
+                  </pic:blipFill>
+                  <pic:spPr>
+                    <a:xfrm>
+                      <a:off x="0" y="0"/>
+                      <a:ext cx="5580000" cy="3138750"/>
+                    </a:xfrm>
+                    <a:prstGeom prst="rect"/>
+                  </pic:spPr>
+                </pic:pic>
+              </a:graphicData>
+            </a:graphic>
+          </wp:inline>
+        </w:drawing>
+      </w:r>
+    </w:p>
+    <w:p>
+      <w:pPr>
+        <w:spacing w:after="200"/>
+        <w:jc w:val="center"/>
+      </w:pPr>
+      <w:r>
+        <w:rPr>
+          <w:b/>
+          <w:i/>
+          <w:sz w:val="18"/>
+        </w:rPr>
+        <w:t xml:space="preserve">Figura 19. </w:t>
+      </w:r>
+      <w:r>
+        <w:rPr>
+          <w:i/>
+          <w:sz w:val="18"/>
+        </w:rPr>
+        <w:t>DEF-11 · EV-CP031-C1-03.png. Administradores + Activos + «zzz»: 0 visibles, 0 esperados</w:t>
+      </w:r>
+    </w:p>
+    <w:p>
+      <w:pPr>
+        <w:pStyle w:val="Heading3"/>
+      </w:pPr>
+      <w:r>
+        <w:t>DEF-13 · Los mensajes emergentes se generan pero nunca se ven: el usuario no recibe confirmaciones ni errores</w:t>
+      </w:r>
+    </w:p>
+    <w:p>
+      <w:pPr>
+        <w:keepNext/>
+        <w:spacing w:before="80" w:after="40"/>
+        <w:jc w:val="center"/>
+      </w:pPr>
+      <w:r>
+        <w:drawing>
+          <wp:inline xmlns:a="http://schemas.openxmlformats.org/drawingml/2006/main" xmlns:pic="http://schemas.openxmlformats.org/drawingml/2006/picture">
+            <wp:extent cx="5580000" cy="3138750"/>
+            <wp:docPr id="20" name="Picture 20"/>
+            <wp:cNvGraphicFramePr>
+              <a:graphicFrameLocks noChangeAspect="1"/>
+            </wp:cNvGraphicFramePr>
+            <a:graphic>
+              <a:graphicData uri="http://schemas.openxmlformats.org/drawingml/2006/picture">
+                <pic:pic>
+                  <pic:nvPicPr>
+                    <pic:cNvPr id="0" name="EV-CP016-C1-01.jpg"/>
+                    <pic:cNvPicPr/>
+                  </pic:nvPicPr>
+                  <pic:blipFill>
+                    <a:blip r:embed="rId29"/>
+                    <a:stretch>
+                      <a:fillRect/>
+                    </a:stretch>
+                  </pic:blipFill>
+                  <pic:spPr>
+                    <a:xfrm>
+                      <a:off x="0" y="0"/>
+                      <a:ext cx="5580000" cy="3138750"/>
+                    </a:xfrm>
+                    <a:prstGeom prst="rect"/>
+                  </pic:spPr>
+                </pic:pic>
+              </a:graphicData>
+            </a:graphic>
+          </wp:inline>
+        </w:drawing>
+      </w:r>
+    </w:p>
+    <w:p>
+      <w:pPr>
+        <w:spacing w:after="200"/>
+        <w:jc w:val="center"/>
+      </w:pPr>
+      <w:r>
+        <w:rPr>
+          <w:b/>
+          <w:i/>
+          <w:sz w:val="18"/>
+        </w:rPr>
+        <w:t xml:space="preserve">Figura 20. </w:t>
+      </w:r>
+      <w:r>
+        <w:rPr>
+          <w:i/>
+          <w:sz w:val="18"/>
+        </w:rPr>
+        <w:t>DEF-13 · EV-CP016-C1-01.png. Perfil guardado → 200. El elemento #tostada tiene el texto «Perfil guardado correctamente» y las clases «tostada tostada--visible», con opacidad calculada 0</w:t>
+      </w:r>
+    </w:p>
+    <w:p>
+      <w:pPr>
+        <w:keepNext/>
+        <w:spacing w:before="80" w:after="40"/>
+        <w:jc w:val="center"/>
+      </w:pPr>
+      <w:r>
+        <w:drawing>
+          <wp:inline xmlns:a="http://schemas.openxmlformats.org/drawingml/2006/main" xmlns:pic="http://schemas.openxmlformats.org/drawingml/2006/picture">
+            <wp:extent cx="5580000" cy="3138750"/>
+            <wp:docPr id="21" name="Picture 21"/>
+            <wp:cNvGraphicFramePr>
+              <a:graphicFrameLocks noChangeAspect="1"/>
+            </wp:cNvGraphicFramePr>
+            <a:graphic>
+              <a:graphicData uri="http://schemas.openxmlformats.org/drawingml/2006/picture">
+                <pic:pic>
+                  <pic:nvPicPr>
+                    <pic:cNvPr id="0" name="EV-CP024-C1-01.jpg"/>
+                    <pic:cNvPicPr/>
+                  </pic:nvPicPr>
+                  <pic:blipFill>
+                    <a:blip r:embed="rId30"/>
+                    <a:stretch>
+                      <a:fillRect/>
+                    </a:stretch>
+                  </pic:blipFill>
+                  <pic:spPr>
+                    <a:xfrm>
+                      <a:off x="0" y="0"/>
+                      <a:ext cx="5580000" cy="3138750"/>
+                    </a:xfrm>
+                    <a:prstGeom prst="rect"/>
+                  </pic:spPr>
+                </pic:pic>
+              </a:graphicData>
+            </a:graphic>
+          </wp:inline>
+        </w:drawing>
+      </w:r>
+    </w:p>
+    <w:p>
+      <w:pPr>
+        <w:spacing w:after="200"/>
+        <w:jc w:val="center"/>
+      </w:pPr>
+      <w:r>
+        <w:rPr>
+          <w:b/>
+          <w:i/>
+          <w:sz w:val="18"/>
+        </w:rPr>
+        <w:t xml:space="preserve">Figura 21. </w:t>
+      </w:r>
+      <w:r>
+        <w:rPr>
+          <w:i/>
+          <w:sz w:val="18"/>
+        </w:rPr>
+        <w:t>DEF-13 · EV-CP024-C1-01.png. Tutoría 08/10/2026 05:12 con Juan Salazar Bedoya (margen real 12.0 h) → PATCH 400 · «Pendiente». El elemento #tostada tiene el texto «Faltan 7h para la tutoría y se requieren 24h de anticipación para cancelar (RN03). Escríbele al docente.» y las clases «tostada tostada--visible tostada--error», con opacidad calculada 0</w:t>
+      </w:r>
+    </w:p>
+    <w:p>
+      <w:pPr>
+        <w:pStyle w:val="Heading3"/>
+      </w:pPr>
+      <w:r>
+        <w:t>DEF-14 · El estudiante que deja vacío el promedio queda con 0 y recibe alertas académicas, aunque su panel dice «Sin alertas»</w:t>
+      </w:r>
+    </w:p>
+    <w:p>
+      <w:pPr>
+        <w:keepNext/>
+        <w:spacing w:before="80" w:after="40"/>
+        <w:jc w:val="center"/>
+      </w:pPr>
+      <w:r>
+        <w:drawing>
+          <wp:inline xmlns:a="http://schemas.openxmlformats.org/drawingml/2006/main" xmlns:pic="http://schemas.openxmlformats.org/drawingml/2006/picture">
+            <wp:extent cx="5580000" cy="3138750"/>
+            <wp:docPr id="22" name="Picture 22"/>
+            <wp:cNvGraphicFramePr>
+              <a:graphicFrameLocks noChangeAspect="1"/>
+            </wp:cNvGraphicFramePr>
+            <a:graphic>
+              <a:graphicData uri="http://schemas.openxmlformats.org/drawingml/2006/picture">
+                <pic:pic>
+                  <pic:nvPicPr>
+                    <pic:cNvPr id="0" name="EV-DEF14-C1-01.jpg"/>
+                    <pic:cNvPicPr/>
+                  </pic:nvPicPr>
+                  <pic:blipFill>
+                    <a:blip r:embed="rId31"/>
+                    <a:stretch>
+                      <a:fillRect/>
+                    </a:stretch>
+                  </pic:blipFill>
+                  <pic:spPr>
+                    <a:xfrm>
+                      <a:off x="0" y="0"/>
+                      <a:ext cx="5580000" cy="3138750"/>
+                    </a:xfrm>
+                    <a:prstGeom prst="rect"/>
+                  </pic:spPr>
+                </pic:pic>
+              </a:graphicData>
+            </a:graphic>
+          </wp:inline>
+        </w:drawing>
+      </w:r>
+    </w:p>
+    <w:p>
+      <w:pPr>
+        <w:spacing w:after="200"/>
+        <w:jc w:val="center"/>
+      </w:pPr>
+      <w:r>
+        <w:rPr>
+          <w:b/>
+          <w:i/>
+          <w:sz w:val="18"/>
+        </w:rPr>
+        <w:t xml:space="preserve">Figura 22. </w:t>
+      </w:r>
+      <w:r>
+        <w:rPr>
+          <w:i/>
+          <w:sz w:val="18"/>
+        </w:rPr>
+        <w:t>DEF-14 · EV-DEF14-C1-01.png. Promedio guardado en la base: 0. El panel del estudiante dice «Sin alertas»</w:t>
+      </w:r>
+    </w:p>
+    <w:p>
+      <w:pPr>
+        <w:keepNext/>
+        <w:spacing w:before="80" w:after="40"/>
+        <w:jc w:val="center"/>
+      </w:pPr>
+      <w:r>
+        <w:drawing>
+          <wp:inline xmlns:a="http://schemas.openxmlformats.org/drawingml/2006/main" xmlns:pic="http://schemas.openxmlformats.org/drawingml/2006/picture">
+            <wp:extent cx="5580000" cy="3138750"/>
+            <wp:docPr id="23" name="Picture 23"/>
+            <wp:cNvGraphicFramePr>
+              <a:graphicFrameLocks noChangeAspect="1"/>
+            </wp:cNvGraphicFramePr>
+            <a:graphic>
+              <a:graphicData uri="http://schemas.openxmlformats.org/drawingml/2006/picture">
+                <pic:pic>
+                  <pic:nvPicPr>
+                    <pic:cNvPr id="0" name="EV-DEF14-C1-02.jpg"/>
+                    <pic:cNvPicPr/>
+                  </pic:nvPicPr>
+                  <pic:blipFill>
+                    <a:blip r:embed="rId32"/>
+                    <a:stretch>
+                      <a:fillRect/>
+                    </a:stretch>
+                  </pic:blipFill>
+                  <pic:spPr>
+                    <a:xfrm>
+                      <a:off x="0" y="0"/>
+                      <a:ext cx="5580000" cy="3138750"/>
+                    </a:xfrm>
+                    <a:prstGeom prst="rect"/>
+                  </pic:spPr>
+                </pic:pic>
+              </a:graphicData>
+            </a:graphic>
+          </wp:inline>
+        </w:drawing>
+      </w:r>
+    </w:p>
+    <w:p>
+      <w:pPr>
+        <w:spacing w:after="200"/>
+        <w:jc w:val="center"/>
+      </w:pPr>
+      <w:r>
+        <w:rPr>
+          <w:b/>
+          <w:i/>
+          <w:sz w:val="18"/>
+        </w:rPr>
+        <w:t xml:space="preserve">Figura 23. </w:t>
+      </w:r>
+      <w:r>
+        <w:rPr>
+          <w:i/>
+          <w:sz w:val="18"/>
+        </w:rPr>
+        <w:t>DEF-14 · EV-DEF14-C1-02.png. Campana abierta: llega «Seguimiento académico», enviada a «Todos los estudiantes en alerta»</w:t>
+      </w:r>
+    </w:p>
     <w:sectPr>
       <w:footerReference w:type="default" r:id="rId9"/>
       <w:pgSz w:w="12240" w:h="15840"/>

</xml_diff>